<commit_message>
02/03/2026 - Actualización docu
Actualizacion de la documentacion de trabajo diario realizado
</commit_message>
<xml_diff>
--- a/eco_woods/Documentacion/02_03_2026.docx
+++ b/eco_woods/Documentacion/02_03_2026.docx
@@ -2,6 +2,386 @@
 <file path=word/document.xml><?xml version="1.0" encoding="utf-8"?>
 <w:document xmlns:wpc="http://schemas.microsoft.com/office/word/2010/wordprocessingCanvas" xmlns:cx="http://schemas.microsoft.com/office/drawing/2014/chartex" xmlns:cx1="http://schemas.microsoft.com/office/drawing/2015/9/8/chartex" xmlns:cx2="http://schemas.microsoft.com/office/drawing/2015/10/21/chartex" xmlns:cx3="http://schemas.microsoft.com/office/drawing/2016/5/9/chartex" xmlns:cx4="http://schemas.microsoft.com/office/drawing/2016/5/10/chartex" xmlns:cx5="http://schemas.microsoft.com/office/drawing/2016/5/11/chartex" xmlns:cx6="http://schemas.microsoft.com/office/drawing/2016/5/12/chartex" xmlns:cx7="http://schemas.microsoft.com/office/drawing/2016/5/13/chartex" xmlns:cx8="http://schemas.microsoft.com/office/drawing/2016/5/14/chartex" xmlns:mc="http://schemas.openxmlformats.org/markup-compatibility/2006" xmlns:aink="http://schemas.microsoft.com/office/drawing/2016/ink" xmlns:am3d="http://schemas.microsoft.com/office/drawing/2017/model3d" xmlns:o="urn:schemas-microsoft-com:office:office" xmlns:oel="http://schemas.microsoft.com/office/2019/extlst" xmlns:r="http://schemas.openxmlformats.org/officeDocument/2006/relationships" xmlns:m="http://schemas.openxmlformats.org/officeDocument/2006/math" xmlns:v="urn:schemas-microsoft-com:vml" xmlns:wp14="http://schemas.microsoft.com/office/word/2010/wordprocessingDrawing" xmlns:wp="http://schemas.openxmlformats.org/drawingml/2006/wordprocessingDrawing" xmlns:w10="urn:schemas-microsoft-com:office:word" xmlns:w="http://schemas.openxmlformats.org/wordprocessingml/2006/main" xmlns:w14="http://schemas.microsoft.com/office/word/2010/wordml" xmlns:w15="http://schemas.microsoft.com/office/word/2012/wordml" xmlns:w16cex="http://schemas.microsoft.com/office/word/2018/wordml/cex" xmlns:w16cid="http://schemas.microsoft.com/office/word/2016/wordml/cid" xmlns:w16="http://schemas.microsoft.com/office/word/2018/wordml" xmlns:w16du="http://schemas.microsoft.com/office/word/2023/wordml/word16du" xmlns:w16sdtdh="http://schemas.microsoft.com/office/word/2020/wordml/sdtdatahash" xmlns:w16sdtfl="http://schemas.microsoft.com/office/word/2024/wordml/sdtformatlock" xmlns:w16se="http://schemas.microsoft.com/office/word/2015/wordml/symex" xmlns:wpg="http://schemas.microsoft.com/office/word/2010/wordprocessingGroup" xmlns:wpi="http://schemas.microsoft.com/office/word/2010/wordprocessingInk" xmlns:wne="http://schemas.microsoft.com/office/word/2006/wordml" xmlns:wps="http://schemas.microsoft.com/office/word/2010/wordprocessingShape" mc:Ignorable="w14 w15 w16se w16cid w16 w16cex w16sdtdh w16sdtfl w16du wp14">
   <w:body>
+    <w:p>
+      <w:r>
+        <w:rPr>
+          <w:b/>
+          <w:bCs/>
+        </w:rPr>
+        <w:t>Consolidación técnica, seguridad y estabilidad del proyecto web</w:t>
+      </w:r>
+    </w:p>
+    <w:p>
+      <w:r>
+        <w:t>Este documento recoge de forma completa el trabajo realizado para reforzar la base del proyecto, mejorar la seguridad, unificar comportamientos y dejar el código en un estado más mantenible y profesional.</w:t>
+      </w:r>
+    </w:p>
+    <w:p>
+      <w:r>
+        <w:rPr>
+          <w:b/>
+          <w:bCs/>
+        </w:rPr>
+        <w:t>Base del proyecto y organización interna</w:t>
+      </w:r>
+      <w:r>
+        <w:br/>
+        <w:t>Se trabajó en ordenar la estructura del código para reducir repeticiones y evitar que cada página resolviera las mismas tareas por su cuenta. Se consolidó el uso de archivos comunes para el arranque de sesión, control de acceso, validaciones, respuestas y maquetación general.</w:t>
+      </w:r>
+      <w:r>
+        <w:br/>
+        <w:t>El resultado es que ahora el proyecto tiene una base más clara: cuando hay que aplicar una mejora global, se puede hacer desde componentes compartidos en vez de editar muchos archivos de forma manual.</w:t>
+      </w:r>
+    </w:p>
+    <w:p>
+      <w:r>
+        <w:rPr>
+          <w:b/>
+          <w:bCs/>
+        </w:rPr>
+        <w:t>Seguridad en acciones sensibles</w:t>
+      </w:r>
+      <w:r>
+        <w:br/>
+        <w:t>Se reforzaron operaciones que modifican datos, como favoritos, carrito, publicación de contenido, envío de reseñas, envío de mensajes, eliminaciones y cierre de compra en modo prueba.</w:t>
+      </w:r>
+      <w:r>
+        <w:br/>
+        <w:t>El objetivo fue que estas acciones no se ejecuten de manera insegura o accidental, y que siempre exista una validación de sesión y de origen legítimo de la solicitud.</w:t>
+      </w:r>
+      <w:r>
+        <w:br/>
+        <w:t>Esto reduce riesgos de uso indebido y mejora la confiabilidad del comportamiento en zonas críticas del sistema.</w:t>
+      </w:r>
+    </w:p>
+    <w:p>
+      <w:r>
+        <w:rPr>
+          <w:b/>
+          <w:bCs/>
+        </w:rPr>
+        <w:t>Control de acceso y permisos</w:t>
+      </w:r>
+      <w:r>
+        <w:br/>
+        <w:t>Se unificó la forma de comprobar qué usuario puede hacer qué acción.</w:t>
+      </w:r>
+      <w:r>
+        <w:br/>
+        <w:t>Se aplicó control consistente para:</w:t>
+      </w:r>
+    </w:p>
+    <w:p>
+      <w:pPr>
+        <w:numPr>
+          <w:ilvl w:val="0"/>
+          <w:numId w:val="1"/>
+        </w:numPr>
+      </w:pPr>
+      <w:r>
+        <w:t>acceso de usuarios autenticados en áreas privadas,</w:t>
+      </w:r>
+    </w:p>
+    <w:p>
+      <w:pPr>
+        <w:numPr>
+          <w:ilvl w:val="0"/>
+          <w:numId w:val="1"/>
+        </w:numPr>
+      </w:pPr>
+      <w:r>
+        <w:t>permisos de administrador en paneles y tareas de gestión,</w:t>
+      </w:r>
+    </w:p>
+    <w:p>
+      <w:pPr>
+        <w:numPr>
+          <w:ilvl w:val="0"/>
+          <w:numId w:val="1"/>
+        </w:numPr>
+      </w:pPr>
+      <w:r>
+        <w:t>comprobación de propiedad o autorización antes de mostrar o eliminar contenido.</w:t>
+      </w:r>
+      <w:r>
+        <w:br/>
+        <w:t>Esto evita accesos incorrectos y deja reglas de permisos más claras y centralizadas.</w:t>
+      </w:r>
+    </w:p>
+    <w:p>
+      <w:r>
+        <w:rPr>
+          <w:b/>
+          <w:bCs/>
+        </w:rPr>
+        <w:t xml:space="preserve">Unificación de respuestas entre </w:t>
+      </w:r>
+      <w:proofErr w:type="spellStart"/>
+      <w:r>
+        <w:rPr>
+          <w:b/>
+          <w:bCs/>
+        </w:rPr>
+        <w:t>backend</w:t>
+      </w:r>
+      <w:proofErr w:type="spellEnd"/>
+      <w:r>
+        <w:rPr>
+          <w:b/>
+          <w:bCs/>
+        </w:rPr>
+        <w:t xml:space="preserve"> y </w:t>
+      </w:r>
+      <w:proofErr w:type="spellStart"/>
+      <w:r>
+        <w:rPr>
+          <w:b/>
+          <w:bCs/>
+        </w:rPr>
+        <w:t>frontend</w:t>
+      </w:r>
+      <w:proofErr w:type="spellEnd"/>
+      <w:r>
+        <w:br/>
+        <w:t xml:space="preserve">Se revisaron </w:t>
+      </w:r>
+      <w:proofErr w:type="spellStart"/>
+      <w:r>
+        <w:t>endpoints</w:t>
+      </w:r>
+      <w:proofErr w:type="spellEnd"/>
+      <w:r>
+        <w:t xml:space="preserve"> y respuestas para que el </w:t>
+      </w:r>
+      <w:proofErr w:type="spellStart"/>
+      <w:r>
+        <w:t>frontend</w:t>
+      </w:r>
+      <w:proofErr w:type="spellEnd"/>
+      <w:r>
+        <w:t xml:space="preserve"> reciba información en un formato más coherente y predecible.</w:t>
+      </w:r>
+      <w:r>
+        <w:br/>
+        <w:t>También se ajustaron tipos de datos y validaciones para evitar ambigüedades al consumir datos desde JavaScript.</w:t>
+      </w:r>
+      <w:r>
+        <w:br/>
+        <w:t>Con esto, la comunicación entre interfaz y servidor es más estable y se simplifica el mantenimiento futuro.</w:t>
+      </w:r>
+    </w:p>
+    <w:p>
+      <w:r>
+        <w:rPr>
+          <w:b/>
+          <w:bCs/>
+        </w:rPr>
+        <w:t>Mejoras en publicación de contenido</w:t>
+      </w:r>
+      <w:r>
+        <w:br/>
+        <w:t>En la zona de publicación se reforzó el flujo de seguridad, se añadieron validaciones y se mejoró la consistencia general del proceso.</w:t>
+      </w:r>
+      <w:r>
+        <w:br/>
+        <w:t>Se mantuvo la funcionalidad original (publicar mueble o recambio según rol), pero con mayor control y mejor organización interna.</w:t>
+      </w:r>
+      <w:r>
+        <w:br/>
+        <w:t>Además, se documentó el comportamiento para que sea más fácil entender por qué se toman ciertas decisiones técnicas.</w:t>
+      </w:r>
+    </w:p>
+    <w:p>
+      <w:r>
+        <w:rPr>
+          <w:b/>
+          <w:bCs/>
+        </w:rPr>
+        <w:t>Mejoras en carrito y cierre de compra</w:t>
+      </w:r>
+      <w:r>
+        <w:br/>
+        <w:t xml:space="preserve">El flujo de carrito fue revisado para mantener coherencia en altas, modificación de cantidades </w:t>
+      </w:r>
+      <w:r>
+        <w:lastRenderedPageBreak/>
+        <w:t xml:space="preserve">y eliminación de </w:t>
+      </w:r>
+      <w:proofErr w:type="spellStart"/>
+      <w:r>
+        <w:t>items</w:t>
+      </w:r>
+      <w:proofErr w:type="spellEnd"/>
+      <w:r>
+        <w:t>, con respuestas claras para la interfaz.</w:t>
+      </w:r>
+      <w:r>
+        <w:br/>
+        <w:t>La finalización de compra se dejó en un modelo más seguro y controlado, evitando cambios de estado en contextos no adecuados y manteniendo una confirmación explícita del usuario en modo prueba.</w:t>
+      </w:r>
+      <w:r>
+        <w:br/>
+        <w:t>Esto mejora la fiabilidad del flujo transaccional y evita comportamientos inesperados.</w:t>
+      </w:r>
+    </w:p>
+    <w:p>
+      <w:r>
+        <w:rPr>
+          <w:b/>
+          <w:bCs/>
+        </w:rPr>
+        <w:t>Mejoras en mensajería entre usuarios</w:t>
+      </w:r>
+      <w:r>
+        <w:br/>
+        <w:t>Se fortaleció el acceso a mensajes para que solo las partes implicadas puedan ver y responder conversaciones.</w:t>
+      </w:r>
+      <w:r>
+        <w:br/>
+        <w:t>Se reforzó el envío de respuestas con validaciones de seguridad y se estandarizó la estructura general del archivo para hacerlo más mantenible.</w:t>
+      </w:r>
+      <w:r>
+        <w:br/>
+        <w:t>El flujo funcional se mantiene, pero con más control y con mejor protección.</w:t>
+      </w:r>
+    </w:p>
+    <w:p>
+      <w:r>
+        <w:rPr>
+          <w:b/>
+          <w:bCs/>
+        </w:rPr>
+        <w:t>Favoritos y comportamiento del lado cliente</w:t>
+      </w:r>
+      <w:r>
+        <w:br/>
+        <w:t xml:space="preserve">Se revisó la lógica de favoritos para que </w:t>
+      </w:r>
+      <w:proofErr w:type="spellStart"/>
+      <w:r>
+        <w:t>backend</w:t>
+      </w:r>
+      <w:proofErr w:type="spellEnd"/>
+      <w:r>
+        <w:t xml:space="preserve"> y </w:t>
+      </w:r>
+      <w:proofErr w:type="spellStart"/>
+      <w:r>
+        <w:t>frontend</w:t>
+      </w:r>
+      <w:proofErr w:type="spellEnd"/>
+      <w:r>
+        <w:t xml:space="preserve"> trabajen con el mismo criterio de seguridad y respuesta.</w:t>
+      </w:r>
+      <w:r>
+        <w:br/>
+        <w:t>Se ajustaron llamadas asíncronas en cliente para alinearlas con el nuevo comportamiento del servidor y evitar patrones menos seguros.</w:t>
+      </w:r>
+      <w:r>
+        <w:br/>
+        <w:t>Se mantuvo la experiencia de usuario esperada, mejorando por debajo la robustez del sistema.</w:t>
+      </w:r>
+    </w:p>
+    <w:p>
+      <w:r>
+        <w:rPr>
+          <w:b/>
+          <w:bCs/>
+        </w:rPr>
+        <w:t>Gestión de eliminaciones y operaciones administrativas</w:t>
+      </w:r>
+      <w:r>
+        <w:br/>
+        <w:t>Se estandarizó el control previo en acciones de eliminación de muebles y reseñas, así como en operaciones administrativas relacionadas.</w:t>
+      </w:r>
+      <w:r>
+        <w:br/>
+        <w:t>El objetivo fue asegurar que no se ejecuten borrados sin validación correcta del usuario y sus permisos.</w:t>
+      </w:r>
+      <w:r>
+        <w:br/>
+        <w:t>Con esto, las tareas de gestión quedan más seguras y con reglas más claras.</w:t>
+      </w:r>
+    </w:p>
+    <w:p>
+      <w:r>
+        <w:rPr>
+          <w:b/>
+          <w:bCs/>
+        </w:rPr>
+        <w:t>Calidad del código y documentación interna</w:t>
+      </w:r>
+      <w:r>
+        <w:br/>
+        <w:t>Se añadieron comentarios explicativos en distintos archivos para dejar claro qué hace cada bloque, por qué se hace de esa forma y qué objetivo cumple dentro del proyecto.</w:t>
+      </w:r>
+      <w:r>
+        <w:br/>
+        <w:t>También se hicieron limpiezas de formato y pequeñas correcciones de legibilidad para facilitar el trabajo futuro y reducir fricción al mantener el sistema.</w:t>
+      </w:r>
+    </w:p>
+    <w:p>
+      <w:r>
+        <w:rPr>
+          <w:b/>
+          <w:bCs/>
+        </w:rPr>
+        <w:t>Pruebas técnicas y funcionales realizadas</w:t>
+      </w:r>
+      <w:r>
+        <w:br/>
+        <w:t>Se validó la sintaxis de los archivos modificados y se ejecutaron pruebas funcionales locales con base de datos activa.</w:t>
+      </w:r>
+      <w:r>
+        <w:br/>
+        <w:t xml:space="preserve">Se comprobaron rutas públicas, restricciones en zonas privadas, comportamiento de </w:t>
+      </w:r>
+      <w:proofErr w:type="spellStart"/>
+      <w:r>
+        <w:t>endpoints</w:t>
+      </w:r>
+      <w:proofErr w:type="spellEnd"/>
+      <w:r>
+        <w:t xml:space="preserve"> protegidos, flujo de registro/</w:t>
+      </w:r>
+      <w:proofErr w:type="spellStart"/>
+      <w:r>
+        <w:t>login</w:t>
+      </w:r>
+      <w:proofErr w:type="spellEnd"/>
+      <w:r>
+        <w:t>, funcionamiento de carrito y confirmación de compra de prueba.</w:t>
+      </w:r>
+      <w:r>
+        <w:br/>
+        <w:t>Los resultados fueron correctos dentro del alcance de la revisión.</w:t>
+      </w:r>
+    </w:p>
+    <w:p>
+      <w:r>
+        <w:rPr>
+          <w:b/>
+          <w:bCs/>
+        </w:rPr>
+        <w:t>Resultado final del trabajo</w:t>
+      </w:r>
+      <w:r>
+        <w:br/>
+        <w:t xml:space="preserve">El proyecto queda con una base más estable, </w:t>
+      </w:r>
+      <w:proofErr w:type="gramStart"/>
+      <w:r>
+        <w:t>más segura y más clara</w:t>
+      </w:r>
+      <w:proofErr w:type="gramEnd"/>
+      <w:r>
+        <w:t xml:space="preserve"> para seguir evolucionando.</w:t>
+      </w:r>
+      <w:r>
+        <w:br/>
+        <w:t>No solo se hicieron cambios puntuales: se consolidó una forma de trabajo homogénea en todo el ecosistema de la web, lo que reduce errores, mejora mantenimiento y facilita futuras mejoras de diseño y negocio.</w:t>
+      </w:r>
+    </w:p>
     <w:p/>
     <w:sectPr>
       <w:pgSz w:w="11906" w:h="16838"/>
@@ -11,6 +391,163 @@
     </w:sectPr>
   </w:body>
 </w:document>
+</file>
+
+<file path=word/numbering.xml><?xml version="1.0" encoding="utf-8"?>
+<w:numbering xmlns:wpc="http://schemas.microsoft.com/office/word/2010/wordprocessingCanvas" xmlns:cx="http://schemas.microsoft.com/office/drawing/2014/chartex" xmlns:cx1="http://schemas.microsoft.com/office/drawing/2015/9/8/chartex" xmlns:cx2="http://schemas.microsoft.com/office/drawing/2015/10/21/chartex" xmlns:cx3="http://schemas.microsoft.com/office/drawing/2016/5/9/chartex" xmlns:cx4="http://schemas.microsoft.com/office/drawing/2016/5/10/chartex" xmlns:cx5="http://schemas.microsoft.com/office/drawing/2016/5/11/chartex" xmlns:cx6="http://schemas.microsoft.com/office/drawing/2016/5/12/chartex" xmlns:cx7="http://schemas.microsoft.com/office/drawing/2016/5/13/chartex" xmlns:cx8="http://schemas.microsoft.com/office/drawing/2016/5/14/chartex" xmlns:mc="http://schemas.openxmlformats.org/markup-compatibility/2006" xmlns:aink="http://schemas.microsoft.com/office/drawing/2016/ink" xmlns:am3d="http://schemas.microsoft.com/office/drawing/2017/model3d" xmlns:o="urn:schemas-microsoft-com:office:office" xmlns:oel="http://schemas.microsoft.com/office/2019/extlst" xmlns:r="http://schemas.openxmlformats.org/officeDocument/2006/relationships" xmlns:m="http://schemas.openxmlformats.org/officeDocument/2006/math" xmlns:v="urn:schemas-microsoft-com:vml" xmlns:wp14="http://schemas.microsoft.com/office/word/2010/wordprocessingDrawing" xmlns:wp="http://schemas.openxmlformats.org/drawingml/2006/wordprocessingDrawing" xmlns:w10="urn:schemas-microsoft-com:office:word" xmlns:w="http://schemas.openxmlformats.org/wordprocessingml/2006/main" xmlns:w14="http://schemas.microsoft.com/office/word/2010/wordml" xmlns:w15="http://schemas.microsoft.com/office/word/2012/wordml" xmlns:w16cex="http://schemas.microsoft.com/office/word/2018/wordml/cex" xmlns:w16cid="http://schemas.microsoft.com/office/word/2016/wordml/cid" xmlns:w16="http://schemas.microsoft.com/office/word/2018/wordml" xmlns:w16du="http://schemas.microsoft.com/office/word/2023/wordml/word16du" xmlns:w16sdtdh="http://schemas.microsoft.com/office/word/2020/wordml/sdtdatahash" xmlns:w16sdtfl="http://schemas.microsoft.com/office/word/2024/wordml/sdtformatlock" xmlns:w16se="http://schemas.microsoft.com/office/word/2015/wordml/symex" xmlns:wpg="http://schemas.microsoft.com/office/word/2010/wordprocessingGroup" xmlns:wpi="http://schemas.microsoft.com/office/word/2010/wordprocessingInk" xmlns:wne="http://schemas.microsoft.com/office/word/2006/wordml" xmlns:wps="http://schemas.microsoft.com/office/word/2010/wordprocessingShape" mc:Ignorable="w14 w15 w16se w16cid w16 w16cex w16sdtdh w16sdtfl w16du wp14">
+  <w:abstractNum w:abstractNumId="0" w15:restartNumberingAfterBreak="0">
+    <w:nsid w:val="75CA086E"/>
+    <w:multiLevelType w:val="multilevel"/>
+    <w:tmpl w:val="0DDC188E"/>
+    <w:lvl w:ilvl="0">
+      <w:start w:val="1"/>
+      <w:numFmt w:val="bullet"/>
+      <w:lvlText w:val=""/>
+      <w:lvlJc w:val="left"/>
+      <w:pPr>
+        <w:tabs>
+          <w:tab w:val="num" w:pos="720"/>
+        </w:tabs>
+        <w:ind w:left="720" w:hanging="360"/>
+      </w:pPr>
+      <w:rPr>
+        <w:rFonts w:ascii="Symbol" w:hAnsi="Symbol" w:hint="default"/>
+        <w:sz w:val="20"/>
+      </w:rPr>
+    </w:lvl>
+    <w:lvl w:ilvl="1" w:tentative="1">
+      <w:start w:val="1"/>
+      <w:numFmt w:val="bullet"/>
+      <w:lvlText w:val=""/>
+      <w:lvlJc w:val="left"/>
+      <w:pPr>
+        <w:tabs>
+          <w:tab w:val="num" w:pos="1440"/>
+        </w:tabs>
+        <w:ind w:left="1440" w:hanging="360"/>
+      </w:pPr>
+      <w:rPr>
+        <w:rFonts w:ascii="Symbol" w:hAnsi="Symbol" w:hint="default"/>
+        <w:sz w:val="20"/>
+      </w:rPr>
+    </w:lvl>
+    <w:lvl w:ilvl="2" w:tentative="1">
+      <w:start w:val="1"/>
+      <w:numFmt w:val="bullet"/>
+      <w:lvlText w:val=""/>
+      <w:lvlJc w:val="left"/>
+      <w:pPr>
+        <w:tabs>
+          <w:tab w:val="num" w:pos="2160"/>
+        </w:tabs>
+        <w:ind w:left="2160" w:hanging="360"/>
+      </w:pPr>
+      <w:rPr>
+        <w:rFonts w:ascii="Symbol" w:hAnsi="Symbol" w:hint="default"/>
+        <w:sz w:val="20"/>
+      </w:rPr>
+    </w:lvl>
+    <w:lvl w:ilvl="3" w:tentative="1">
+      <w:start w:val="1"/>
+      <w:numFmt w:val="bullet"/>
+      <w:lvlText w:val=""/>
+      <w:lvlJc w:val="left"/>
+      <w:pPr>
+        <w:tabs>
+          <w:tab w:val="num" w:pos="2880"/>
+        </w:tabs>
+        <w:ind w:left="2880" w:hanging="360"/>
+      </w:pPr>
+      <w:rPr>
+        <w:rFonts w:ascii="Symbol" w:hAnsi="Symbol" w:hint="default"/>
+        <w:sz w:val="20"/>
+      </w:rPr>
+    </w:lvl>
+    <w:lvl w:ilvl="4" w:tentative="1">
+      <w:start w:val="1"/>
+      <w:numFmt w:val="bullet"/>
+      <w:lvlText w:val=""/>
+      <w:lvlJc w:val="left"/>
+      <w:pPr>
+        <w:tabs>
+          <w:tab w:val="num" w:pos="3600"/>
+        </w:tabs>
+        <w:ind w:left="3600" w:hanging="360"/>
+      </w:pPr>
+      <w:rPr>
+        <w:rFonts w:ascii="Symbol" w:hAnsi="Symbol" w:hint="default"/>
+        <w:sz w:val="20"/>
+      </w:rPr>
+    </w:lvl>
+    <w:lvl w:ilvl="5" w:tentative="1">
+      <w:start w:val="1"/>
+      <w:numFmt w:val="bullet"/>
+      <w:lvlText w:val=""/>
+      <w:lvlJc w:val="left"/>
+      <w:pPr>
+        <w:tabs>
+          <w:tab w:val="num" w:pos="4320"/>
+        </w:tabs>
+        <w:ind w:left="4320" w:hanging="360"/>
+      </w:pPr>
+      <w:rPr>
+        <w:rFonts w:ascii="Symbol" w:hAnsi="Symbol" w:hint="default"/>
+        <w:sz w:val="20"/>
+      </w:rPr>
+    </w:lvl>
+    <w:lvl w:ilvl="6" w:tentative="1">
+      <w:start w:val="1"/>
+      <w:numFmt w:val="bullet"/>
+      <w:lvlText w:val=""/>
+      <w:lvlJc w:val="left"/>
+      <w:pPr>
+        <w:tabs>
+          <w:tab w:val="num" w:pos="5040"/>
+        </w:tabs>
+        <w:ind w:left="5040" w:hanging="360"/>
+      </w:pPr>
+      <w:rPr>
+        <w:rFonts w:ascii="Symbol" w:hAnsi="Symbol" w:hint="default"/>
+        <w:sz w:val="20"/>
+      </w:rPr>
+    </w:lvl>
+    <w:lvl w:ilvl="7" w:tentative="1">
+      <w:start w:val="1"/>
+      <w:numFmt w:val="bullet"/>
+      <w:lvlText w:val=""/>
+      <w:lvlJc w:val="left"/>
+      <w:pPr>
+        <w:tabs>
+          <w:tab w:val="num" w:pos="5760"/>
+        </w:tabs>
+        <w:ind w:left="5760" w:hanging="360"/>
+      </w:pPr>
+      <w:rPr>
+        <w:rFonts w:ascii="Symbol" w:hAnsi="Symbol" w:hint="default"/>
+        <w:sz w:val="20"/>
+      </w:rPr>
+    </w:lvl>
+    <w:lvl w:ilvl="8" w:tentative="1">
+      <w:start w:val="1"/>
+      <w:numFmt w:val="bullet"/>
+      <w:lvlText w:val=""/>
+      <w:lvlJc w:val="left"/>
+      <w:pPr>
+        <w:tabs>
+          <w:tab w:val="num" w:pos="6480"/>
+        </w:tabs>
+        <w:ind w:left="6480" w:hanging="360"/>
+      </w:pPr>
+      <w:rPr>
+        <w:rFonts w:ascii="Symbol" w:hAnsi="Symbol" w:hint="default"/>
+        <w:sz w:val="20"/>
+      </w:rPr>
+    </w:lvl>
+  </w:abstractNum>
+  <w:num w:numId="1" w16cid:durableId="711660795">
+    <w:abstractNumId w:val="0"/>
+  </w:num>
+</w:numbering>
 </file>
 
 <file path=word/styles.xml><?xml version="1.0" encoding="utf-8"?>
@@ -614,7 +1151,6 @@
   <w:style w:type="character" w:default="1" w:styleId="Fuentedeprrafopredeter">
     <w:name w:val="Default Paragraph Font"/>
     <w:uiPriority w:val="1"/>
-    <w:semiHidden/>
     <w:unhideWhenUsed/>
   </w:style>
   <w:style w:type="table" w:default="1" w:styleId="Tablanormal">

</xml_diff>

<commit_message>
02/03/2026 - Añadido a documentación
Añadido del trabajo realizado dentro de la documentación del proyecto
</commit_message>
<xml_diff>
--- a/eco_woods/Documentacion/02_03_2026.docx
+++ b/eco_woods/Documentacion/02_03_2026.docx
@@ -380,6 +380,891 @@
       <w:r>
         <w:br/>
         <w:t>No solo se hicieron cambios puntuales: se consolidó una forma de trabajo homogénea en todo el ecosistema de la web, lo que reduce errores, mejora mantenimiento y facilita futuras mejoras de diseño y negocio.</w:t>
+      </w:r>
+    </w:p>
+    <w:p>
+      <w:r>
+        <w:br/>
+      </w:r>
+      <w:r>
+        <w:br/>
+      </w:r>
+      <w:r>
+        <w:lastRenderedPageBreak/>
+        <w:br/>
+      </w:r>
+      <w:r>
+        <w:tab/>
+      </w:r>
+      <w:r>
+        <w:rPr>
+          <w:b/>
+          <w:bCs/>
+        </w:rPr>
+        <w:t>Renovación visual y mejora de experiencia de uso del proyecto</w:t>
+      </w:r>
+    </w:p>
+    <w:p>
+      <w:r>
+        <w:t>En esta fase he trabajado de forma integral la parte visual de la web para que deje de verse como un prototipo básico y pase a tener una imagen más profesional, más coherente y más agradable para el usuario.</w:t>
+      </w:r>
+      <w:r>
+        <w:br/>
+        <w:t>Mi enfoque no ha sido solo “cambiar colores”, sino definir una identidad visual completa y aplicarla de manera consistente en las páginas clave del proyecto.</w:t>
+      </w:r>
+    </w:p>
+    <w:p>
+      <w:r>
+        <w:rPr>
+          <w:b/>
+          <w:bCs/>
+        </w:rPr>
+        <w:t>Dirección visual y objetivo de diseño</w:t>
+      </w:r>
+      <w:r>
+        <w:br/>
+        <w:t>He definido una línea visual centrada en una sensación natural, cercana y profesional, alineada con el concepto del proyecto (segunda mano, sostenibilidad y reparación).</w:t>
+      </w:r>
+      <w:r>
+        <w:br/>
+        <w:t>Mi objetivo ha sido que el usuario sienta desde el primer vistazo que está en una plataforma clara, fiable y moderna, donde todo está organizado y es fácil de entender.</w:t>
+      </w:r>
+    </w:p>
+    <w:p>
+      <w:r>
+        <w:rPr>
+          <w:b/>
+          <w:bCs/>
+        </w:rPr>
+        <w:t>Sistema de color y estética general</w:t>
+      </w:r>
+      <w:r>
+        <w:br/>
+        <w:t>He trabajado una paleta más equilibrada para mejorar legibilidad y coherencia:</w:t>
+      </w:r>
+    </w:p>
+    <w:p>
+      <w:pPr>
+        <w:numPr>
+          <w:ilvl w:val="0"/>
+          <w:numId w:val="2"/>
+        </w:numPr>
+      </w:pPr>
+      <w:r>
+        <w:t>base clara con tonos marfil/tierra,</w:t>
+      </w:r>
+    </w:p>
+    <w:p>
+      <w:pPr>
+        <w:numPr>
+          <w:ilvl w:val="0"/>
+          <w:numId w:val="2"/>
+        </w:numPr>
+      </w:pPr>
+      <w:r>
+        <w:t>verdes suavizados para evitar una estética demasiado oscura,</w:t>
+      </w:r>
+    </w:p>
+    <w:p>
+      <w:pPr>
+        <w:numPr>
+          <w:ilvl w:val="0"/>
+          <w:numId w:val="2"/>
+        </w:numPr>
+      </w:pPr>
+      <w:r>
+        <w:t>acentos cálidos para destacar acciones importantes.</w:t>
+      </w:r>
+    </w:p>
+    <w:p>
+      <w:r>
+        <w:t>Además, he ajustado contrastes para que texto, botones, estados y bloques tengan mejor visibilidad tanto en escritorio como en móvil.</w:t>
+      </w:r>
+    </w:p>
+    <w:p>
+      <w:r>
+        <w:rPr>
+          <w:b/>
+          <w:bCs/>
+        </w:rPr>
+        <w:t>Tipografía y jerarquía de lectura</w:t>
+      </w:r>
+      <w:r>
+        <w:br/>
+        <w:t>He renovado la tipografía y su jerarquía para que haya diferencia clara entre:</w:t>
+      </w:r>
+    </w:p>
+    <w:p>
+      <w:pPr>
+        <w:numPr>
+          <w:ilvl w:val="0"/>
+          <w:numId w:val="3"/>
+        </w:numPr>
+      </w:pPr>
+      <w:r>
+        <w:t>títulos de sección,</w:t>
+      </w:r>
+    </w:p>
+    <w:p>
+      <w:pPr>
+        <w:numPr>
+          <w:ilvl w:val="0"/>
+          <w:numId w:val="3"/>
+        </w:numPr>
+      </w:pPr>
+      <w:r>
+        <w:t>subtítulos,</w:t>
+      </w:r>
+    </w:p>
+    <w:p>
+      <w:pPr>
+        <w:numPr>
+          <w:ilvl w:val="0"/>
+          <w:numId w:val="3"/>
+        </w:numPr>
+      </w:pPr>
+      <w:r>
+        <w:t>texto de contenido,</w:t>
+      </w:r>
+    </w:p>
+    <w:p>
+      <w:pPr>
+        <w:numPr>
+          <w:ilvl w:val="0"/>
+          <w:numId w:val="3"/>
+        </w:numPr>
+      </w:pPr>
+      <w:r>
+        <w:t>elementos de acción.</w:t>
+      </w:r>
+    </w:p>
+    <w:p>
+      <w:r>
+        <w:t>Con esto, el usuario puede escanear mejor cada pantalla y entender más rápido dónde está y qué puede hacer.</w:t>
+      </w:r>
+    </w:p>
+    <w:p>
+      <w:r>
+        <w:rPr>
+          <w:b/>
+          <w:bCs/>
+        </w:rPr>
+        <w:t>Reestructuración de componentes visuales base</w:t>
+      </w:r>
+      <w:r>
+        <w:br/>
+        <w:t>He rediseñado la capa global de estilos para que toda la interfaz comparta la misma lógica visual:</w:t>
+      </w:r>
+    </w:p>
+    <w:p>
+      <w:pPr>
+        <w:numPr>
+          <w:ilvl w:val="0"/>
+          <w:numId w:val="4"/>
+        </w:numPr>
+      </w:pPr>
+      <w:r>
+        <w:t>tarjetas de contenido con mejor presencia,</w:t>
+      </w:r>
+    </w:p>
+    <w:p>
+      <w:pPr>
+        <w:numPr>
+          <w:ilvl w:val="0"/>
+          <w:numId w:val="4"/>
+        </w:numPr>
+      </w:pPr>
+      <w:r>
+        <w:t>botones con variantes claras y consistentes,</w:t>
+      </w:r>
+    </w:p>
+    <w:p>
+      <w:pPr>
+        <w:numPr>
+          <w:ilvl w:val="0"/>
+          <w:numId w:val="4"/>
+        </w:numPr>
+      </w:pPr>
+      <w:r>
+        <w:t>formularios más ordenados y legibles,</w:t>
+      </w:r>
+    </w:p>
+    <w:p>
+      <w:pPr>
+        <w:numPr>
+          <w:ilvl w:val="0"/>
+          <w:numId w:val="4"/>
+        </w:numPr>
+      </w:pPr>
+      <w:r>
+        <w:t>mensajes de error y éxito más visibles,</w:t>
+      </w:r>
+    </w:p>
+    <w:p>
+      <w:pPr>
+        <w:numPr>
+          <w:ilvl w:val="0"/>
+          <w:numId w:val="4"/>
+        </w:numPr>
+      </w:pPr>
+      <w:r>
+        <w:t>tablas y bloques de datos con mejor limpieza visual.</w:t>
+      </w:r>
+    </w:p>
+    <w:p>
+      <w:r>
+        <w:t>También he eliminado dependencias visuales dispersas para centralizar estilos y facilitar mantenimiento futuro.</w:t>
+      </w:r>
+    </w:p>
+    <w:p>
+      <w:r>
+        <w:rPr>
+          <w:b/>
+          <w:bCs/>
+        </w:rPr>
+        <w:lastRenderedPageBreak/>
+        <w:t>Cabecera, navegación e identidad de marca</w:t>
+      </w:r>
+      <w:r>
+        <w:br/>
+        <w:t>He dedicado una parte importante al bloque superior (logo + menú), porque era crítico para percepción general:</w:t>
+      </w:r>
+    </w:p>
+    <w:p>
+      <w:pPr>
+        <w:numPr>
+          <w:ilvl w:val="0"/>
+          <w:numId w:val="5"/>
+        </w:numPr>
+      </w:pPr>
+      <w:r>
+        <w:t>he mejorado la presencia del logo de GR-Inn,</w:t>
+      </w:r>
+    </w:p>
+    <w:p>
+      <w:pPr>
+        <w:numPr>
+          <w:ilvl w:val="0"/>
+          <w:numId w:val="5"/>
+        </w:numPr>
+      </w:pPr>
+      <w:r>
+        <w:t>he hecho más visibles los nombres de las secciones del menú,</w:t>
+      </w:r>
+    </w:p>
+    <w:p>
+      <w:pPr>
+        <w:numPr>
+          <w:ilvl w:val="0"/>
+          <w:numId w:val="5"/>
+        </w:numPr>
+      </w:pPr>
+      <w:r>
+        <w:t xml:space="preserve">he mejorado estados visuales (normal, </w:t>
+      </w:r>
+      <w:proofErr w:type="spellStart"/>
+      <w:r>
+        <w:t>hover</w:t>
+      </w:r>
+      <w:proofErr w:type="spellEnd"/>
+      <w:r>
+        <w:t>, activo),</w:t>
+      </w:r>
+    </w:p>
+    <w:p>
+      <w:pPr>
+        <w:numPr>
+          <w:ilvl w:val="0"/>
+          <w:numId w:val="5"/>
+        </w:numPr>
+      </w:pPr>
+      <w:r>
+        <w:t>he corregido alineación vertical para que logo y menú queden centrados dentro de la franja,</w:t>
+      </w:r>
+    </w:p>
+    <w:p>
+      <w:pPr>
+        <w:numPr>
+          <w:ilvl w:val="0"/>
+          <w:numId w:val="5"/>
+        </w:numPr>
+      </w:pPr>
+      <w:r>
+        <w:t xml:space="preserve">he hecho varios ajustes finos de tamaño y posición según </w:t>
+      </w:r>
+      <w:proofErr w:type="spellStart"/>
+      <w:r>
+        <w:t>feedback</w:t>
+      </w:r>
+      <w:proofErr w:type="spellEnd"/>
+      <w:r>
+        <w:t xml:space="preserve"> directo.</w:t>
+      </w:r>
+    </w:p>
+    <w:p>
+      <w:r>
+        <w:t>Todo esto lo he hecho cuidando no romper el comportamiento de navegación.</w:t>
+      </w:r>
+    </w:p>
+    <w:p>
+      <w:r>
+        <w:rPr>
+          <w:b/>
+          <w:bCs/>
+        </w:rPr>
+        <w:t>Evolución de portada</w:t>
+      </w:r>
+      <w:r>
+        <w:br/>
+        <w:t>He transformado la portada para que comunique mejor:</w:t>
+      </w:r>
+    </w:p>
+    <w:p>
+      <w:pPr>
+        <w:numPr>
+          <w:ilvl w:val="0"/>
+          <w:numId w:val="6"/>
+        </w:numPr>
+      </w:pPr>
+      <w:r>
+        <w:t>propuesta de valor principal,</w:t>
+      </w:r>
+    </w:p>
+    <w:p>
+      <w:pPr>
+        <w:numPr>
+          <w:ilvl w:val="0"/>
+          <w:numId w:val="6"/>
+        </w:numPr>
+      </w:pPr>
+      <w:r>
+        <w:t>acciones rápidas,</w:t>
+      </w:r>
+    </w:p>
+    <w:p>
+      <w:pPr>
+        <w:numPr>
+          <w:ilvl w:val="0"/>
+          <w:numId w:val="6"/>
+        </w:numPr>
+      </w:pPr>
+      <w:r>
+        <w:t>estructura de presentación más clara y más “producto real”.</w:t>
+      </w:r>
+    </w:p>
+    <w:p>
+      <w:r>
+        <w:t>He incorporado una cabecera de impacto y bloques de contenido mejor distribuidos para que la entrada al sitio sea más convincente y más útil.</w:t>
+      </w:r>
+    </w:p>
+    <w:p>
+      <w:r>
+        <w:rPr>
+          <w:b/>
+          <w:bCs/>
+        </w:rPr>
+        <w:t>Mejora de páginas de catálogo (muebles y recambios)</w:t>
+      </w:r>
+      <w:r>
+        <w:br/>
+        <w:t>He mejorado visualmente los listados para que:</w:t>
+      </w:r>
+    </w:p>
+    <w:p>
+      <w:pPr>
+        <w:numPr>
+          <w:ilvl w:val="0"/>
+          <w:numId w:val="7"/>
+        </w:numPr>
+      </w:pPr>
+      <w:r>
+        <w:t>se entienda mejor el contexto del catálogo,</w:t>
+      </w:r>
+    </w:p>
+    <w:p>
+      <w:pPr>
+        <w:numPr>
+          <w:ilvl w:val="0"/>
+          <w:numId w:val="7"/>
+        </w:numPr>
+      </w:pPr>
+      <w:r>
+        <w:t>filtros y resultados se lean de forma más clara,</w:t>
+      </w:r>
+    </w:p>
+    <w:p>
+      <w:pPr>
+        <w:numPr>
+          <w:ilvl w:val="0"/>
+          <w:numId w:val="7"/>
+        </w:numPr>
+      </w:pPr>
+      <w:r>
+        <w:t>tarjetas tengan mejor orden visual,</w:t>
+      </w:r>
+    </w:p>
+    <w:p>
+      <w:pPr>
+        <w:numPr>
+          <w:ilvl w:val="0"/>
+          <w:numId w:val="7"/>
+        </w:numPr>
+      </w:pPr>
+      <w:r>
+        <w:t>estados sin resultados sean más elegantes y comprensibles.</w:t>
+      </w:r>
+    </w:p>
+    <w:p>
+      <w:r>
+        <w:t>He mantenido intacta la lógica funcional de filtros, favoritos y carrito, centrándome en mejorar presentación y usabilidad.</w:t>
+      </w:r>
+    </w:p>
+    <w:p>
+      <w:r>
+        <w:rPr>
+          <w:b/>
+          <w:bCs/>
+        </w:rPr>
+        <w:t>Mejora de páginas de detalle (producto y recambio)</w:t>
+      </w:r>
+      <w:r>
+        <w:br/>
+        <w:t>He trabajado el detalle de productos para hacerlo más limpio y coherente:</w:t>
+      </w:r>
+    </w:p>
+    <w:p>
+      <w:pPr>
+        <w:numPr>
+          <w:ilvl w:val="0"/>
+          <w:numId w:val="8"/>
+        </w:numPr>
+      </w:pPr>
+      <w:r>
+        <w:t>navegación de retorno más visible,</w:t>
+      </w:r>
+    </w:p>
+    <w:p>
+      <w:pPr>
+        <w:numPr>
+          <w:ilvl w:val="0"/>
+          <w:numId w:val="8"/>
+        </w:numPr>
+      </w:pPr>
+      <w:r>
+        <w:t>bloques de acciones mejor agrupados,</w:t>
+      </w:r>
+    </w:p>
+    <w:p>
+      <w:pPr>
+        <w:numPr>
+          <w:ilvl w:val="0"/>
+          <w:numId w:val="8"/>
+        </w:numPr>
+      </w:pPr>
+      <w:r>
+        <w:t>zona de compartir más integrada en el diseño,</w:t>
+      </w:r>
+    </w:p>
+    <w:p>
+      <w:pPr>
+        <w:numPr>
+          <w:ilvl w:val="0"/>
+          <w:numId w:val="8"/>
+        </w:numPr>
+      </w:pPr>
+      <w:r>
+        <w:t>presentación de datos más clara,</w:t>
+      </w:r>
+    </w:p>
+    <w:p>
+      <w:pPr>
+        <w:numPr>
+          <w:ilvl w:val="0"/>
+          <w:numId w:val="8"/>
+        </w:numPr>
+      </w:pPr>
+      <w:r>
+        <w:t>mejor continuidad visual con el resto del sistema.</w:t>
+      </w:r>
+    </w:p>
+    <w:p>
+      <w:r>
+        <w:t>He aplicado esto en detalle de mueble y detalle de recambio para que ambos flujos se perciban como parte de la misma experiencia.</w:t>
+      </w:r>
+    </w:p>
+    <w:p>
+      <w:r>
+        <w:rPr>
+          <w:b/>
+          <w:bCs/>
+        </w:rPr>
+        <w:lastRenderedPageBreak/>
+        <w:t>Mejora de carrito</w:t>
+      </w:r>
+      <w:r>
+        <w:br/>
+        <w:t>He mejorado la visualización del carrito para que sea más usable:</w:t>
+      </w:r>
+    </w:p>
+    <w:p>
+      <w:pPr>
+        <w:numPr>
+          <w:ilvl w:val="0"/>
+          <w:numId w:val="9"/>
+        </w:numPr>
+      </w:pPr>
+      <w:r>
+        <w:t>mejor lectura de líneas de producto,</w:t>
+      </w:r>
+    </w:p>
+    <w:p>
+      <w:pPr>
+        <w:numPr>
+          <w:ilvl w:val="0"/>
+          <w:numId w:val="9"/>
+        </w:numPr>
+      </w:pPr>
+      <w:r>
+        <w:t>controles de cantidad más claros,</w:t>
+      </w:r>
+    </w:p>
+    <w:p>
+      <w:pPr>
+        <w:numPr>
+          <w:ilvl w:val="0"/>
+          <w:numId w:val="9"/>
+        </w:numPr>
+      </w:pPr>
+      <w:r>
+        <w:t>botón de eliminar más comprensible,</w:t>
+      </w:r>
+    </w:p>
+    <w:p>
+      <w:pPr>
+        <w:numPr>
+          <w:ilvl w:val="0"/>
+          <w:numId w:val="9"/>
+        </w:numPr>
+      </w:pPr>
+      <w:r>
+        <w:t>mejor visibilidad de subtotal y total,</w:t>
+      </w:r>
+    </w:p>
+    <w:p>
+      <w:pPr>
+        <w:numPr>
+          <w:ilvl w:val="0"/>
+          <w:numId w:val="9"/>
+        </w:numPr>
+      </w:pPr>
+      <w:r>
+        <w:t>mejor armonía visual con el resto de páginas.</w:t>
+      </w:r>
+    </w:p>
+    <w:p>
+      <w:r>
+        <w:rPr>
+          <w:b/>
+          <w:bCs/>
+        </w:rPr>
+        <w:t>Mejora de formularios de acceso y registro</w:t>
+      </w:r>
+      <w:r>
+        <w:br/>
+        <w:t xml:space="preserve">He ajustado </w:t>
+      </w:r>
+      <w:proofErr w:type="spellStart"/>
+      <w:r>
+        <w:t>login</w:t>
+      </w:r>
+      <w:proofErr w:type="spellEnd"/>
+      <w:r>
+        <w:t xml:space="preserve"> y registro para que se vean más limpios y actuales:</w:t>
+      </w:r>
+    </w:p>
+    <w:p>
+      <w:pPr>
+        <w:numPr>
+          <w:ilvl w:val="0"/>
+          <w:numId w:val="10"/>
+        </w:numPr>
+      </w:pPr>
+      <w:r>
+        <w:t>mejor estructura visual,</w:t>
+      </w:r>
+    </w:p>
+    <w:p>
+      <w:pPr>
+        <w:numPr>
+          <w:ilvl w:val="0"/>
+          <w:numId w:val="10"/>
+        </w:numPr>
+      </w:pPr>
+      <w:r>
+        <w:t>jerarquía más clara de títulos, campos y mensajes,</w:t>
+      </w:r>
+    </w:p>
+    <w:p>
+      <w:pPr>
+        <w:numPr>
+          <w:ilvl w:val="0"/>
+          <w:numId w:val="10"/>
+        </w:numPr>
+      </w:pPr>
+      <w:r>
+        <w:t>integración completa con la nueva línea visual general.</w:t>
+      </w:r>
+    </w:p>
+    <w:p>
+      <w:r>
+        <w:rPr>
+          <w:b/>
+          <w:bCs/>
+        </w:rPr>
+        <w:t>Mejora de publicación</w:t>
+      </w:r>
+      <w:r>
+        <w:br/>
+        <w:t>He adaptado la pantalla de publicación para que encaje con el nuevo diseño:</w:t>
+      </w:r>
+    </w:p>
+    <w:p>
+      <w:pPr>
+        <w:numPr>
+          <w:ilvl w:val="0"/>
+          <w:numId w:val="11"/>
+        </w:numPr>
+      </w:pPr>
+      <w:r>
+        <w:t>contenedor más ordenado,</w:t>
+      </w:r>
+    </w:p>
+    <w:p>
+      <w:pPr>
+        <w:numPr>
+          <w:ilvl w:val="0"/>
+          <w:numId w:val="11"/>
+        </w:numPr>
+      </w:pPr>
+      <w:r>
+        <w:t>acciones superiores mejor integradas,</w:t>
+      </w:r>
+    </w:p>
+    <w:p>
+      <w:pPr>
+        <w:numPr>
+          <w:ilvl w:val="0"/>
+          <w:numId w:val="11"/>
+        </w:numPr>
+      </w:pPr>
+      <w:r>
+        <w:t xml:space="preserve">mejor continuidad visual para usuarios normales y </w:t>
+      </w:r>
+      <w:proofErr w:type="spellStart"/>
+      <w:r>
+        <w:t>admin</w:t>
+      </w:r>
+      <w:proofErr w:type="spellEnd"/>
+      <w:r>
+        <w:t>.</w:t>
+      </w:r>
+    </w:p>
+    <w:p>
+      <w:r>
+        <w:t>La lógica de publicación se ha mantenido, pero con una presentación más clara y profesional.</w:t>
+      </w:r>
+    </w:p>
+    <w:p>
+      <w:r>
+        <w:rPr>
+          <w:b/>
+          <w:bCs/>
+        </w:rPr>
+        <w:t>Responsive y experiencia en diferentes resoluciones</w:t>
+      </w:r>
+      <w:r>
+        <w:br/>
+        <w:t>He realizado ajustes para que el diseño responda mejor en pantallas distintas:</w:t>
+      </w:r>
+    </w:p>
+    <w:p>
+      <w:pPr>
+        <w:numPr>
+          <w:ilvl w:val="0"/>
+          <w:numId w:val="12"/>
+        </w:numPr>
+      </w:pPr>
+      <w:r>
+        <w:t>distribución de bloques y tarjetas en móvil/escritorio,</w:t>
+      </w:r>
+    </w:p>
+    <w:p>
+      <w:pPr>
+        <w:numPr>
+          <w:ilvl w:val="0"/>
+          <w:numId w:val="12"/>
+        </w:numPr>
+      </w:pPr>
+      <w:r>
+        <w:t>legibilidad de menú y cabecera,</w:t>
+      </w:r>
+    </w:p>
+    <w:p>
+      <w:pPr>
+        <w:numPr>
+          <w:ilvl w:val="0"/>
+          <w:numId w:val="12"/>
+        </w:numPr>
+      </w:pPr>
+      <w:r>
+        <w:t>comportamiento de formularios y filtros en tamaños reducidos,</w:t>
+      </w:r>
+    </w:p>
+    <w:p>
+      <w:pPr>
+        <w:numPr>
+          <w:ilvl w:val="0"/>
+          <w:numId w:val="12"/>
+        </w:numPr>
+      </w:pPr>
+      <w:r>
+        <w:t>mantenimiento de coherencia visual entre resoluciones.</w:t>
+      </w:r>
+    </w:p>
+    <w:p>
+      <w:r>
+        <w:rPr>
+          <w:b/>
+          <w:bCs/>
+        </w:rPr>
+        <w:t>Iteración y ajuste fino basado en revisión real</w:t>
+      </w:r>
+      <w:r>
+        <w:br/>
+        <w:t>Durante la implementación he hecho ajustes incrementales según revisión visual en navegador:</w:t>
+      </w:r>
+    </w:p>
+    <w:p>
+      <w:pPr>
+        <w:numPr>
+          <w:ilvl w:val="0"/>
+          <w:numId w:val="13"/>
+        </w:numPr>
+      </w:pPr>
+      <w:r>
+        <w:t>correcciones en tonos para evitar exceso de oscuridad,</w:t>
+      </w:r>
+    </w:p>
+    <w:p>
+      <w:pPr>
+        <w:numPr>
+          <w:ilvl w:val="0"/>
+          <w:numId w:val="13"/>
+        </w:numPr>
+      </w:pPr>
+      <w:r>
+        <w:t>cambios en tamaño y alineación del logo,</w:t>
+      </w:r>
+    </w:p>
+    <w:p>
+      <w:pPr>
+        <w:numPr>
+          <w:ilvl w:val="0"/>
+          <w:numId w:val="13"/>
+        </w:numPr>
+      </w:pPr>
+      <w:r>
+        <w:t>mejoras en visibilidad del texto de navegación,</w:t>
+      </w:r>
+    </w:p>
+    <w:p>
+      <w:pPr>
+        <w:numPr>
+          <w:ilvl w:val="0"/>
+          <w:numId w:val="13"/>
+        </w:numPr>
+      </w:pPr>
+      <w:r>
+        <w:t>realineación de elementos dentro de la franja de cabecera sin romper su tamaño.</w:t>
+      </w:r>
+    </w:p>
+    <w:p>
+      <w:r>
+        <w:t>Este punto ha sido clave para convertir una mejora “técnicamente correcta” en una mejora realmente percibida por el usuario.</w:t>
+      </w:r>
+    </w:p>
+    <w:p>
+      <w:r>
+        <w:rPr>
+          <w:b/>
+          <w:bCs/>
+        </w:rPr>
+        <w:lastRenderedPageBreak/>
+        <w:t>Resultado alcanzado</w:t>
+      </w:r>
+      <w:r>
+        <w:br/>
+        <w:t>Con todo este trabajo he dejado la interfaz del proyecto en un estado claramente superior:</w:t>
+      </w:r>
+    </w:p>
+    <w:p>
+      <w:pPr>
+        <w:numPr>
+          <w:ilvl w:val="0"/>
+          <w:numId w:val="14"/>
+        </w:numPr>
+      </w:pPr>
+      <w:r>
+        <w:t>imagen más profesional,</w:t>
+      </w:r>
+    </w:p>
+    <w:p>
+      <w:pPr>
+        <w:numPr>
+          <w:ilvl w:val="0"/>
+          <w:numId w:val="14"/>
+        </w:numPr>
+      </w:pPr>
+      <w:r>
+        <w:t>identidad visual más coherente,</w:t>
+      </w:r>
+    </w:p>
+    <w:p>
+      <w:pPr>
+        <w:numPr>
+          <w:ilvl w:val="0"/>
+          <w:numId w:val="14"/>
+        </w:numPr>
+      </w:pPr>
+      <w:r>
+        <w:t>navegación y lectura más claras,</w:t>
+      </w:r>
+    </w:p>
+    <w:p>
+      <w:pPr>
+        <w:numPr>
+          <w:ilvl w:val="0"/>
+          <w:numId w:val="14"/>
+        </w:numPr>
+      </w:pPr>
+      <w:r>
+        <w:t>mejor equilibrio de color y contraste,</w:t>
+      </w:r>
+    </w:p>
+    <w:p>
+      <w:pPr>
+        <w:numPr>
+          <w:ilvl w:val="0"/>
+          <w:numId w:val="14"/>
+        </w:numPr>
+      </w:pPr>
+      <w:r>
+        <w:t>experiencia más sólida en conjunto.</w:t>
+      </w:r>
+    </w:p>
+    <w:p>
+      <w:r>
+        <w:t>El proyecto mantiene su funcionalidad y ahora transmite mucha más calidad visual y consistencia de producto.</w:t>
       </w:r>
     </w:p>
     <w:p/>
@@ -396,6 +1281,1347 @@
 <file path=word/numbering.xml><?xml version="1.0" encoding="utf-8"?>
 <w:numbering xmlns:wpc="http://schemas.microsoft.com/office/word/2010/wordprocessingCanvas" xmlns:cx="http://schemas.microsoft.com/office/drawing/2014/chartex" xmlns:cx1="http://schemas.microsoft.com/office/drawing/2015/9/8/chartex" xmlns:cx2="http://schemas.microsoft.com/office/drawing/2015/10/21/chartex" xmlns:cx3="http://schemas.microsoft.com/office/drawing/2016/5/9/chartex" xmlns:cx4="http://schemas.microsoft.com/office/drawing/2016/5/10/chartex" xmlns:cx5="http://schemas.microsoft.com/office/drawing/2016/5/11/chartex" xmlns:cx6="http://schemas.microsoft.com/office/drawing/2016/5/12/chartex" xmlns:cx7="http://schemas.microsoft.com/office/drawing/2016/5/13/chartex" xmlns:cx8="http://schemas.microsoft.com/office/drawing/2016/5/14/chartex" xmlns:mc="http://schemas.openxmlformats.org/markup-compatibility/2006" xmlns:aink="http://schemas.microsoft.com/office/drawing/2016/ink" xmlns:am3d="http://schemas.microsoft.com/office/drawing/2017/model3d" xmlns:o="urn:schemas-microsoft-com:office:office" xmlns:oel="http://schemas.microsoft.com/office/2019/extlst" xmlns:r="http://schemas.openxmlformats.org/officeDocument/2006/relationships" xmlns:m="http://schemas.openxmlformats.org/officeDocument/2006/math" xmlns:v="urn:schemas-microsoft-com:vml" xmlns:wp14="http://schemas.microsoft.com/office/word/2010/wordprocessingDrawing" xmlns:wp="http://schemas.openxmlformats.org/drawingml/2006/wordprocessingDrawing" xmlns:w10="urn:schemas-microsoft-com:office:word" xmlns:w="http://schemas.openxmlformats.org/wordprocessingml/2006/main" xmlns:w14="http://schemas.microsoft.com/office/word/2010/wordml" xmlns:w15="http://schemas.microsoft.com/office/word/2012/wordml" xmlns:w16cex="http://schemas.microsoft.com/office/word/2018/wordml/cex" xmlns:w16cid="http://schemas.microsoft.com/office/word/2016/wordml/cid" xmlns:w16="http://schemas.microsoft.com/office/word/2018/wordml" xmlns:w16du="http://schemas.microsoft.com/office/word/2023/wordml/word16du" xmlns:w16sdtdh="http://schemas.microsoft.com/office/word/2020/wordml/sdtdatahash" xmlns:w16sdtfl="http://schemas.microsoft.com/office/word/2024/wordml/sdtformatlock" xmlns:w16se="http://schemas.microsoft.com/office/word/2015/wordml/symex" xmlns:wpg="http://schemas.microsoft.com/office/word/2010/wordprocessingGroup" xmlns:wpi="http://schemas.microsoft.com/office/word/2010/wordprocessingInk" xmlns:wne="http://schemas.microsoft.com/office/word/2006/wordml" xmlns:wps="http://schemas.microsoft.com/office/word/2010/wordprocessingShape" mc:Ignorable="w14 w15 w16se w16cid w16 w16cex w16sdtdh w16sdtfl w16du wp14">
   <w:abstractNum w:abstractNumId="0" w15:restartNumberingAfterBreak="0">
+    <w:nsid w:val="2B675701"/>
+    <w:multiLevelType w:val="multilevel"/>
+    <w:tmpl w:val="F0A21112"/>
+    <w:lvl w:ilvl="0">
+      <w:start w:val="1"/>
+      <w:numFmt w:val="bullet"/>
+      <w:lvlText w:val=""/>
+      <w:lvlJc w:val="left"/>
+      <w:pPr>
+        <w:tabs>
+          <w:tab w:val="num" w:pos="720"/>
+        </w:tabs>
+        <w:ind w:left="720" w:hanging="360"/>
+      </w:pPr>
+      <w:rPr>
+        <w:rFonts w:ascii="Symbol" w:hAnsi="Symbol" w:hint="default"/>
+        <w:sz w:val="20"/>
+      </w:rPr>
+    </w:lvl>
+    <w:lvl w:ilvl="1" w:tentative="1">
+      <w:start w:val="1"/>
+      <w:numFmt w:val="bullet"/>
+      <w:lvlText w:val=""/>
+      <w:lvlJc w:val="left"/>
+      <w:pPr>
+        <w:tabs>
+          <w:tab w:val="num" w:pos="1440"/>
+        </w:tabs>
+        <w:ind w:left="1440" w:hanging="360"/>
+      </w:pPr>
+      <w:rPr>
+        <w:rFonts w:ascii="Symbol" w:hAnsi="Symbol" w:hint="default"/>
+        <w:sz w:val="20"/>
+      </w:rPr>
+    </w:lvl>
+    <w:lvl w:ilvl="2" w:tentative="1">
+      <w:start w:val="1"/>
+      <w:numFmt w:val="bullet"/>
+      <w:lvlText w:val=""/>
+      <w:lvlJc w:val="left"/>
+      <w:pPr>
+        <w:tabs>
+          <w:tab w:val="num" w:pos="2160"/>
+        </w:tabs>
+        <w:ind w:left="2160" w:hanging="360"/>
+      </w:pPr>
+      <w:rPr>
+        <w:rFonts w:ascii="Symbol" w:hAnsi="Symbol" w:hint="default"/>
+        <w:sz w:val="20"/>
+      </w:rPr>
+    </w:lvl>
+    <w:lvl w:ilvl="3" w:tentative="1">
+      <w:start w:val="1"/>
+      <w:numFmt w:val="bullet"/>
+      <w:lvlText w:val=""/>
+      <w:lvlJc w:val="left"/>
+      <w:pPr>
+        <w:tabs>
+          <w:tab w:val="num" w:pos="2880"/>
+        </w:tabs>
+        <w:ind w:left="2880" w:hanging="360"/>
+      </w:pPr>
+      <w:rPr>
+        <w:rFonts w:ascii="Symbol" w:hAnsi="Symbol" w:hint="default"/>
+        <w:sz w:val="20"/>
+      </w:rPr>
+    </w:lvl>
+    <w:lvl w:ilvl="4" w:tentative="1">
+      <w:start w:val="1"/>
+      <w:numFmt w:val="bullet"/>
+      <w:lvlText w:val=""/>
+      <w:lvlJc w:val="left"/>
+      <w:pPr>
+        <w:tabs>
+          <w:tab w:val="num" w:pos="3600"/>
+        </w:tabs>
+        <w:ind w:left="3600" w:hanging="360"/>
+      </w:pPr>
+      <w:rPr>
+        <w:rFonts w:ascii="Symbol" w:hAnsi="Symbol" w:hint="default"/>
+        <w:sz w:val="20"/>
+      </w:rPr>
+    </w:lvl>
+    <w:lvl w:ilvl="5" w:tentative="1">
+      <w:start w:val="1"/>
+      <w:numFmt w:val="bullet"/>
+      <w:lvlText w:val=""/>
+      <w:lvlJc w:val="left"/>
+      <w:pPr>
+        <w:tabs>
+          <w:tab w:val="num" w:pos="4320"/>
+        </w:tabs>
+        <w:ind w:left="4320" w:hanging="360"/>
+      </w:pPr>
+      <w:rPr>
+        <w:rFonts w:ascii="Symbol" w:hAnsi="Symbol" w:hint="default"/>
+        <w:sz w:val="20"/>
+      </w:rPr>
+    </w:lvl>
+    <w:lvl w:ilvl="6" w:tentative="1">
+      <w:start w:val="1"/>
+      <w:numFmt w:val="bullet"/>
+      <w:lvlText w:val=""/>
+      <w:lvlJc w:val="left"/>
+      <w:pPr>
+        <w:tabs>
+          <w:tab w:val="num" w:pos="5040"/>
+        </w:tabs>
+        <w:ind w:left="5040" w:hanging="360"/>
+      </w:pPr>
+      <w:rPr>
+        <w:rFonts w:ascii="Symbol" w:hAnsi="Symbol" w:hint="default"/>
+        <w:sz w:val="20"/>
+      </w:rPr>
+    </w:lvl>
+    <w:lvl w:ilvl="7" w:tentative="1">
+      <w:start w:val="1"/>
+      <w:numFmt w:val="bullet"/>
+      <w:lvlText w:val=""/>
+      <w:lvlJc w:val="left"/>
+      <w:pPr>
+        <w:tabs>
+          <w:tab w:val="num" w:pos="5760"/>
+        </w:tabs>
+        <w:ind w:left="5760" w:hanging="360"/>
+      </w:pPr>
+      <w:rPr>
+        <w:rFonts w:ascii="Symbol" w:hAnsi="Symbol" w:hint="default"/>
+        <w:sz w:val="20"/>
+      </w:rPr>
+    </w:lvl>
+    <w:lvl w:ilvl="8" w:tentative="1">
+      <w:start w:val="1"/>
+      <w:numFmt w:val="bullet"/>
+      <w:lvlText w:val=""/>
+      <w:lvlJc w:val="left"/>
+      <w:pPr>
+        <w:tabs>
+          <w:tab w:val="num" w:pos="6480"/>
+        </w:tabs>
+        <w:ind w:left="6480" w:hanging="360"/>
+      </w:pPr>
+      <w:rPr>
+        <w:rFonts w:ascii="Symbol" w:hAnsi="Symbol" w:hint="default"/>
+        <w:sz w:val="20"/>
+      </w:rPr>
+    </w:lvl>
+  </w:abstractNum>
+  <w:abstractNum w:abstractNumId="1" w15:restartNumberingAfterBreak="0">
+    <w:nsid w:val="36D11BF9"/>
+    <w:multiLevelType w:val="multilevel"/>
+    <w:tmpl w:val="9F5AC0F6"/>
+    <w:lvl w:ilvl="0">
+      <w:start w:val="1"/>
+      <w:numFmt w:val="bullet"/>
+      <w:lvlText w:val=""/>
+      <w:lvlJc w:val="left"/>
+      <w:pPr>
+        <w:tabs>
+          <w:tab w:val="num" w:pos="720"/>
+        </w:tabs>
+        <w:ind w:left="720" w:hanging="360"/>
+      </w:pPr>
+      <w:rPr>
+        <w:rFonts w:ascii="Symbol" w:hAnsi="Symbol" w:hint="default"/>
+        <w:sz w:val="20"/>
+      </w:rPr>
+    </w:lvl>
+    <w:lvl w:ilvl="1" w:tentative="1">
+      <w:start w:val="1"/>
+      <w:numFmt w:val="bullet"/>
+      <w:lvlText w:val=""/>
+      <w:lvlJc w:val="left"/>
+      <w:pPr>
+        <w:tabs>
+          <w:tab w:val="num" w:pos="1440"/>
+        </w:tabs>
+        <w:ind w:left="1440" w:hanging="360"/>
+      </w:pPr>
+      <w:rPr>
+        <w:rFonts w:ascii="Symbol" w:hAnsi="Symbol" w:hint="default"/>
+        <w:sz w:val="20"/>
+      </w:rPr>
+    </w:lvl>
+    <w:lvl w:ilvl="2" w:tentative="1">
+      <w:start w:val="1"/>
+      <w:numFmt w:val="bullet"/>
+      <w:lvlText w:val=""/>
+      <w:lvlJc w:val="left"/>
+      <w:pPr>
+        <w:tabs>
+          <w:tab w:val="num" w:pos="2160"/>
+        </w:tabs>
+        <w:ind w:left="2160" w:hanging="360"/>
+      </w:pPr>
+      <w:rPr>
+        <w:rFonts w:ascii="Symbol" w:hAnsi="Symbol" w:hint="default"/>
+        <w:sz w:val="20"/>
+      </w:rPr>
+    </w:lvl>
+    <w:lvl w:ilvl="3" w:tentative="1">
+      <w:start w:val="1"/>
+      <w:numFmt w:val="bullet"/>
+      <w:lvlText w:val=""/>
+      <w:lvlJc w:val="left"/>
+      <w:pPr>
+        <w:tabs>
+          <w:tab w:val="num" w:pos="2880"/>
+        </w:tabs>
+        <w:ind w:left="2880" w:hanging="360"/>
+      </w:pPr>
+      <w:rPr>
+        <w:rFonts w:ascii="Symbol" w:hAnsi="Symbol" w:hint="default"/>
+        <w:sz w:val="20"/>
+      </w:rPr>
+    </w:lvl>
+    <w:lvl w:ilvl="4" w:tentative="1">
+      <w:start w:val="1"/>
+      <w:numFmt w:val="bullet"/>
+      <w:lvlText w:val=""/>
+      <w:lvlJc w:val="left"/>
+      <w:pPr>
+        <w:tabs>
+          <w:tab w:val="num" w:pos="3600"/>
+        </w:tabs>
+        <w:ind w:left="3600" w:hanging="360"/>
+      </w:pPr>
+      <w:rPr>
+        <w:rFonts w:ascii="Symbol" w:hAnsi="Symbol" w:hint="default"/>
+        <w:sz w:val="20"/>
+      </w:rPr>
+    </w:lvl>
+    <w:lvl w:ilvl="5" w:tentative="1">
+      <w:start w:val="1"/>
+      <w:numFmt w:val="bullet"/>
+      <w:lvlText w:val=""/>
+      <w:lvlJc w:val="left"/>
+      <w:pPr>
+        <w:tabs>
+          <w:tab w:val="num" w:pos="4320"/>
+        </w:tabs>
+        <w:ind w:left="4320" w:hanging="360"/>
+      </w:pPr>
+      <w:rPr>
+        <w:rFonts w:ascii="Symbol" w:hAnsi="Symbol" w:hint="default"/>
+        <w:sz w:val="20"/>
+      </w:rPr>
+    </w:lvl>
+    <w:lvl w:ilvl="6" w:tentative="1">
+      <w:start w:val="1"/>
+      <w:numFmt w:val="bullet"/>
+      <w:lvlText w:val=""/>
+      <w:lvlJc w:val="left"/>
+      <w:pPr>
+        <w:tabs>
+          <w:tab w:val="num" w:pos="5040"/>
+        </w:tabs>
+        <w:ind w:left="5040" w:hanging="360"/>
+      </w:pPr>
+      <w:rPr>
+        <w:rFonts w:ascii="Symbol" w:hAnsi="Symbol" w:hint="default"/>
+        <w:sz w:val="20"/>
+      </w:rPr>
+    </w:lvl>
+    <w:lvl w:ilvl="7" w:tentative="1">
+      <w:start w:val="1"/>
+      <w:numFmt w:val="bullet"/>
+      <w:lvlText w:val=""/>
+      <w:lvlJc w:val="left"/>
+      <w:pPr>
+        <w:tabs>
+          <w:tab w:val="num" w:pos="5760"/>
+        </w:tabs>
+        <w:ind w:left="5760" w:hanging="360"/>
+      </w:pPr>
+      <w:rPr>
+        <w:rFonts w:ascii="Symbol" w:hAnsi="Symbol" w:hint="default"/>
+        <w:sz w:val="20"/>
+      </w:rPr>
+    </w:lvl>
+    <w:lvl w:ilvl="8" w:tentative="1">
+      <w:start w:val="1"/>
+      <w:numFmt w:val="bullet"/>
+      <w:lvlText w:val=""/>
+      <w:lvlJc w:val="left"/>
+      <w:pPr>
+        <w:tabs>
+          <w:tab w:val="num" w:pos="6480"/>
+        </w:tabs>
+        <w:ind w:left="6480" w:hanging="360"/>
+      </w:pPr>
+      <w:rPr>
+        <w:rFonts w:ascii="Symbol" w:hAnsi="Symbol" w:hint="default"/>
+        <w:sz w:val="20"/>
+      </w:rPr>
+    </w:lvl>
+  </w:abstractNum>
+  <w:abstractNum w:abstractNumId="2" w15:restartNumberingAfterBreak="0">
+    <w:nsid w:val="3DDF4E89"/>
+    <w:multiLevelType w:val="multilevel"/>
+    <w:tmpl w:val="211471C4"/>
+    <w:lvl w:ilvl="0">
+      <w:start w:val="1"/>
+      <w:numFmt w:val="bullet"/>
+      <w:lvlText w:val=""/>
+      <w:lvlJc w:val="left"/>
+      <w:pPr>
+        <w:tabs>
+          <w:tab w:val="num" w:pos="720"/>
+        </w:tabs>
+        <w:ind w:left="720" w:hanging="360"/>
+      </w:pPr>
+      <w:rPr>
+        <w:rFonts w:ascii="Symbol" w:hAnsi="Symbol" w:hint="default"/>
+        <w:sz w:val="20"/>
+      </w:rPr>
+    </w:lvl>
+    <w:lvl w:ilvl="1" w:tentative="1">
+      <w:start w:val="1"/>
+      <w:numFmt w:val="bullet"/>
+      <w:lvlText w:val=""/>
+      <w:lvlJc w:val="left"/>
+      <w:pPr>
+        <w:tabs>
+          <w:tab w:val="num" w:pos="1440"/>
+        </w:tabs>
+        <w:ind w:left="1440" w:hanging="360"/>
+      </w:pPr>
+      <w:rPr>
+        <w:rFonts w:ascii="Symbol" w:hAnsi="Symbol" w:hint="default"/>
+        <w:sz w:val="20"/>
+      </w:rPr>
+    </w:lvl>
+    <w:lvl w:ilvl="2" w:tentative="1">
+      <w:start w:val="1"/>
+      <w:numFmt w:val="bullet"/>
+      <w:lvlText w:val=""/>
+      <w:lvlJc w:val="left"/>
+      <w:pPr>
+        <w:tabs>
+          <w:tab w:val="num" w:pos="2160"/>
+        </w:tabs>
+        <w:ind w:left="2160" w:hanging="360"/>
+      </w:pPr>
+      <w:rPr>
+        <w:rFonts w:ascii="Symbol" w:hAnsi="Symbol" w:hint="default"/>
+        <w:sz w:val="20"/>
+      </w:rPr>
+    </w:lvl>
+    <w:lvl w:ilvl="3" w:tentative="1">
+      <w:start w:val="1"/>
+      <w:numFmt w:val="bullet"/>
+      <w:lvlText w:val=""/>
+      <w:lvlJc w:val="left"/>
+      <w:pPr>
+        <w:tabs>
+          <w:tab w:val="num" w:pos="2880"/>
+        </w:tabs>
+        <w:ind w:left="2880" w:hanging="360"/>
+      </w:pPr>
+      <w:rPr>
+        <w:rFonts w:ascii="Symbol" w:hAnsi="Symbol" w:hint="default"/>
+        <w:sz w:val="20"/>
+      </w:rPr>
+    </w:lvl>
+    <w:lvl w:ilvl="4" w:tentative="1">
+      <w:start w:val="1"/>
+      <w:numFmt w:val="bullet"/>
+      <w:lvlText w:val=""/>
+      <w:lvlJc w:val="left"/>
+      <w:pPr>
+        <w:tabs>
+          <w:tab w:val="num" w:pos="3600"/>
+        </w:tabs>
+        <w:ind w:left="3600" w:hanging="360"/>
+      </w:pPr>
+      <w:rPr>
+        <w:rFonts w:ascii="Symbol" w:hAnsi="Symbol" w:hint="default"/>
+        <w:sz w:val="20"/>
+      </w:rPr>
+    </w:lvl>
+    <w:lvl w:ilvl="5" w:tentative="1">
+      <w:start w:val="1"/>
+      <w:numFmt w:val="bullet"/>
+      <w:lvlText w:val=""/>
+      <w:lvlJc w:val="left"/>
+      <w:pPr>
+        <w:tabs>
+          <w:tab w:val="num" w:pos="4320"/>
+        </w:tabs>
+        <w:ind w:left="4320" w:hanging="360"/>
+      </w:pPr>
+      <w:rPr>
+        <w:rFonts w:ascii="Symbol" w:hAnsi="Symbol" w:hint="default"/>
+        <w:sz w:val="20"/>
+      </w:rPr>
+    </w:lvl>
+    <w:lvl w:ilvl="6" w:tentative="1">
+      <w:start w:val="1"/>
+      <w:numFmt w:val="bullet"/>
+      <w:lvlText w:val=""/>
+      <w:lvlJc w:val="left"/>
+      <w:pPr>
+        <w:tabs>
+          <w:tab w:val="num" w:pos="5040"/>
+        </w:tabs>
+        <w:ind w:left="5040" w:hanging="360"/>
+      </w:pPr>
+      <w:rPr>
+        <w:rFonts w:ascii="Symbol" w:hAnsi="Symbol" w:hint="default"/>
+        <w:sz w:val="20"/>
+      </w:rPr>
+    </w:lvl>
+    <w:lvl w:ilvl="7" w:tentative="1">
+      <w:start w:val="1"/>
+      <w:numFmt w:val="bullet"/>
+      <w:lvlText w:val=""/>
+      <w:lvlJc w:val="left"/>
+      <w:pPr>
+        <w:tabs>
+          <w:tab w:val="num" w:pos="5760"/>
+        </w:tabs>
+        <w:ind w:left="5760" w:hanging="360"/>
+      </w:pPr>
+      <w:rPr>
+        <w:rFonts w:ascii="Symbol" w:hAnsi="Symbol" w:hint="default"/>
+        <w:sz w:val="20"/>
+      </w:rPr>
+    </w:lvl>
+    <w:lvl w:ilvl="8" w:tentative="1">
+      <w:start w:val="1"/>
+      <w:numFmt w:val="bullet"/>
+      <w:lvlText w:val=""/>
+      <w:lvlJc w:val="left"/>
+      <w:pPr>
+        <w:tabs>
+          <w:tab w:val="num" w:pos="6480"/>
+        </w:tabs>
+        <w:ind w:left="6480" w:hanging="360"/>
+      </w:pPr>
+      <w:rPr>
+        <w:rFonts w:ascii="Symbol" w:hAnsi="Symbol" w:hint="default"/>
+        <w:sz w:val="20"/>
+      </w:rPr>
+    </w:lvl>
+  </w:abstractNum>
+  <w:abstractNum w:abstractNumId="3" w15:restartNumberingAfterBreak="0">
+    <w:nsid w:val="40E12FDC"/>
+    <w:multiLevelType w:val="multilevel"/>
+    <w:tmpl w:val="A5E003DC"/>
+    <w:lvl w:ilvl="0">
+      <w:start w:val="1"/>
+      <w:numFmt w:val="bullet"/>
+      <w:lvlText w:val=""/>
+      <w:lvlJc w:val="left"/>
+      <w:pPr>
+        <w:tabs>
+          <w:tab w:val="num" w:pos="720"/>
+        </w:tabs>
+        <w:ind w:left="720" w:hanging="360"/>
+      </w:pPr>
+      <w:rPr>
+        <w:rFonts w:ascii="Symbol" w:hAnsi="Symbol" w:hint="default"/>
+        <w:sz w:val="20"/>
+      </w:rPr>
+    </w:lvl>
+    <w:lvl w:ilvl="1" w:tentative="1">
+      <w:start w:val="1"/>
+      <w:numFmt w:val="bullet"/>
+      <w:lvlText w:val=""/>
+      <w:lvlJc w:val="left"/>
+      <w:pPr>
+        <w:tabs>
+          <w:tab w:val="num" w:pos="1440"/>
+        </w:tabs>
+        <w:ind w:left="1440" w:hanging="360"/>
+      </w:pPr>
+      <w:rPr>
+        <w:rFonts w:ascii="Symbol" w:hAnsi="Symbol" w:hint="default"/>
+        <w:sz w:val="20"/>
+      </w:rPr>
+    </w:lvl>
+    <w:lvl w:ilvl="2" w:tentative="1">
+      <w:start w:val="1"/>
+      <w:numFmt w:val="bullet"/>
+      <w:lvlText w:val=""/>
+      <w:lvlJc w:val="left"/>
+      <w:pPr>
+        <w:tabs>
+          <w:tab w:val="num" w:pos="2160"/>
+        </w:tabs>
+        <w:ind w:left="2160" w:hanging="360"/>
+      </w:pPr>
+      <w:rPr>
+        <w:rFonts w:ascii="Symbol" w:hAnsi="Symbol" w:hint="default"/>
+        <w:sz w:val="20"/>
+      </w:rPr>
+    </w:lvl>
+    <w:lvl w:ilvl="3" w:tentative="1">
+      <w:start w:val="1"/>
+      <w:numFmt w:val="bullet"/>
+      <w:lvlText w:val=""/>
+      <w:lvlJc w:val="left"/>
+      <w:pPr>
+        <w:tabs>
+          <w:tab w:val="num" w:pos="2880"/>
+        </w:tabs>
+        <w:ind w:left="2880" w:hanging="360"/>
+      </w:pPr>
+      <w:rPr>
+        <w:rFonts w:ascii="Symbol" w:hAnsi="Symbol" w:hint="default"/>
+        <w:sz w:val="20"/>
+      </w:rPr>
+    </w:lvl>
+    <w:lvl w:ilvl="4" w:tentative="1">
+      <w:start w:val="1"/>
+      <w:numFmt w:val="bullet"/>
+      <w:lvlText w:val=""/>
+      <w:lvlJc w:val="left"/>
+      <w:pPr>
+        <w:tabs>
+          <w:tab w:val="num" w:pos="3600"/>
+        </w:tabs>
+        <w:ind w:left="3600" w:hanging="360"/>
+      </w:pPr>
+      <w:rPr>
+        <w:rFonts w:ascii="Symbol" w:hAnsi="Symbol" w:hint="default"/>
+        <w:sz w:val="20"/>
+      </w:rPr>
+    </w:lvl>
+    <w:lvl w:ilvl="5" w:tentative="1">
+      <w:start w:val="1"/>
+      <w:numFmt w:val="bullet"/>
+      <w:lvlText w:val=""/>
+      <w:lvlJc w:val="left"/>
+      <w:pPr>
+        <w:tabs>
+          <w:tab w:val="num" w:pos="4320"/>
+        </w:tabs>
+        <w:ind w:left="4320" w:hanging="360"/>
+      </w:pPr>
+      <w:rPr>
+        <w:rFonts w:ascii="Symbol" w:hAnsi="Symbol" w:hint="default"/>
+        <w:sz w:val="20"/>
+      </w:rPr>
+    </w:lvl>
+    <w:lvl w:ilvl="6" w:tentative="1">
+      <w:start w:val="1"/>
+      <w:numFmt w:val="bullet"/>
+      <w:lvlText w:val=""/>
+      <w:lvlJc w:val="left"/>
+      <w:pPr>
+        <w:tabs>
+          <w:tab w:val="num" w:pos="5040"/>
+        </w:tabs>
+        <w:ind w:left="5040" w:hanging="360"/>
+      </w:pPr>
+      <w:rPr>
+        <w:rFonts w:ascii="Symbol" w:hAnsi="Symbol" w:hint="default"/>
+        <w:sz w:val="20"/>
+      </w:rPr>
+    </w:lvl>
+    <w:lvl w:ilvl="7" w:tentative="1">
+      <w:start w:val="1"/>
+      <w:numFmt w:val="bullet"/>
+      <w:lvlText w:val=""/>
+      <w:lvlJc w:val="left"/>
+      <w:pPr>
+        <w:tabs>
+          <w:tab w:val="num" w:pos="5760"/>
+        </w:tabs>
+        <w:ind w:left="5760" w:hanging="360"/>
+      </w:pPr>
+      <w:rPr>
+        <w:rFonts w:ascii="Symbol" w:hAnsi="Symbol" w:hint="default"/>
+        <w:sz w:val="20"/>
+      </w:rPr>
+    </w:lvl>
+    <w:lvl w:ilvl="8" w:tentative="1">
+      <w:start w:val="1"/>
+      <w:numFmt w:val="bullet"/>
+      <w:lvlText w:val=""/>
+      <w:lvlJc w:val="left"/>
+      <w:pPr>
+        <w:tabs>
+          <w:tab w:val="num" w:pos="6480"/>
+        </w:tabs>
+        <w:ind w:left="6480" w:hanging="360"/>
+      </w:pPr>
+      <w:rPr>
+        <w:rFonts w:ascii="Symbol" w:hAnsi="Symbol" w:hint="default"/>
+        <w:sz w:val="20"/>
+      </w:rPr>
+    </w:lvl>
+  </w:abstractNum>
+  <w:abstractNum w:abstractNumId="4" w15:restartNumberingAfterBreak="0">
+    <w:nsid w:val="521E05F7"/>
+    <w:multiLevelType w:val="multilevel"/>
+    <w:tmpl w:val="E724DA92"/>
+    <w:lvl w:ilvl="0">
+      <w:start w:val="1"/>
+      <w:numFmt w:val="bullet"/>
+      <w:lvlText w:val=""/>
+      <w:lvlJc w:val="left"/>
+      <w:pPr>
+        <w:tabs>
+          <w:tab w:val="num" w:pos="720"/>
+        </w:tabs>
+        <w:ind w:left="720" w:hanging="360"/>
+      </w:pPr>
+      <w:rPr>
+        <w:rFonts w:ascii="Symbol" w:hAnsi="Symbol" w:hint="default"/>
+        <w:sz w:val="20"/>
+      </w:rPr>
+    </w:lvl>
+    <w:lvl w:ilvl="1" w:tentative="1">
+      <w:start w:val="1"/>
+      <w:numFmt w:val="bullet"/>
+      <w:lvlText w:val=""/>
+      <w:lvlJc w:val="left"/>
+      <w:pPr>
+        <w:tabs>
+          <w:tab w:val="num" w:pos="1440"/>
+        </w:tabs>
+        <w:ind w:left="1440" w:hanging="360"/>
+      </w:pPr>
+      <w:rPr>
+        <w:rFonts w:ascii="Symbol" w:hAnsi="Symbol" w:hint="default"/>
+        <w:sz w:val="20"/>
+      </w:rPr>
+    </w:lvl>
+    <w:lvl w:ilvl="2" w:tentative="1">
+      <w:start w:val="1"/>
+      <w:numFmt w:val="bullet"/>
+      <w:lvlText w:val=""/>
+      <w:lvlJc w:val="left"/>
+      <w:pPr>
+        <w:tabs>
+          <w:tab w:val="num" w:pos="2160"/>
+        </w:tabs>
+        <w:ind w:left="2160" w:hanging="360"/>
+      </w:pPr>
+      <w:rPr>
+        <w:rFonts w:ascii="Symbol" w:hAnsi="Symbol" w:hint="default"/>
+        <w:sz w:val="20"/>
+      </w:rPr>
+    </w:lvl>
+    <w:lvl w:ilvl="3" w:tentative="1">
+      <w:start w:val="1"/>
+      <w:numFmt w:val="bullet"/>
+      <w:lvlText w:val=""/>
+      <w:lvlJc w:val="left"/>
+      <w:pPr>
+        <w:tabs>
+          <w:tab w:val="num" w:pos="2880"/>
+        </w:tabs>
+        <w:ind w:left="2880" w:hanging="360"/>
+      </w:pPr>
+      <w:rPr>
+        <w:rFonts w:ascii="Symbol" w:hAnsi="Symbol" w:hint="default"/>
+        <w:sz w:val="20"/>
+      </w:rPr>
+    </w:lvl>
+    <w:lvl w:ilvl="4" w:tentative="1">
+      <w:start w:val="1"/>
+      <w:numFmt w:val="bullet"/>
+      <w:lvlText w:val=""/>
+      <w:lvlJc w:val="left"/>
+      <w:pPr>
+        <w:tabs>
+          <w:tab w:val="num" w:pos="3600"/>
+        </w:tabs>
+        <w:ind w:left="3600" w:hanging="360"/>
+      </w:pPr>
+      <w:rPr>
+        <w:rFonts w:ascii="Symbol" w:hAnsi="Symbol" w:hint="default"/>
+        <w:sz w:val="20"/>
+      </w:rPr>
+    </w:lvl>
+    <w:lvl w:ilvl="5" w:tentative="1">
+      <w:start w:val="1"/>
+      <w:numFmt w:val="bullet"/>
+      <w:lvlText w:val=""/>
+      <w:lvlJc w:val="left"/>
+      <w:pPr>
+        <w:tabs>
+          <w:tab w:val="num" w:pos="4320"/>
+        </w:tabs>
+        <w:ind w:left="4320" w:hanging="360"/>
+      </w:pPr>
+      <w:rPr>
+        <w:rFonts w:ascii="Symbol" w:hAnsi="Symbol" w:hint="default"/>
+        <w:sz w:val="20"/>
+      </w:rPr>
+    </w:lvl>
+    <w:lvl w:ilvl="6" w:tentative="1">
+      <w:start w:val="1"/>
+      <w:numFmt w:val="bullet"/>
+      <w:lvlText w:val=""/>
+      <w:lvlJc w:val="left"/>
+      <w:pPr>
+        <w:tabs>
+          <w:tab w:val="num" w:pos="5040"/>
+        </w:tabs>
+        <w:ind w:left="5040" w:hanging="360"/>
+      </w:pPr>
+      <w:rPr>
+        <w:rFonts w:ascii="Symbol" w:hAnsi="Symbol" w:hint="default"/>
+        <w:sz w:val="20"/>
+      </w:rPr>
+    </w:lvl>
+    <w:lvl w:ilvl="7" w:tentative="1">
+      <w:start w:val="1"/>
+      <w:numFmt w:val="bullet"/>
+      <w:lvlText w:val=""/>
+      <w:lvlJc w:val="left"/>
+      <w:pPr>
+        <w:tabs>
+          <w:tab w:val="num" w:pos="5760"/>
+        </w:tabs>
+        <w:ind w:left="5760" w:hanging="360"/>
+      </w:pPr>
+      <w:rPr>
+        <w:rFonts w:ascii="Symbol" w:hAnsi="Symbol" w:hint="default"/>
+        <w:sz w:val="20"/>
+      </w:rPr>
+    </w:lvl>
+    <w:lvl w:ilvl="8" w:tentative="1">
+      <w:start w:val="1"/>
+      <w:numFmt w:val="bullet"/>
+      <w:lvlText w:val=""/>
+      <w:lvlJc w:val="left"/>
+      <w:pPr>
+        <w:tabs>
+          <w:tab w:val="num" w:pos="6480"/>
+        </w:tabs>
+        <w:ind w:left="6480" w:hanging="360"/>
+      </w:pPr>
+      <w:rPr>
+        <w:rFonts w:ascii="Symbol" w:hAnsi="Symbol" w:hint="default"/>
+        <w:sz w:val="20"/>
+      </w:rPr>
+    </w:lvl>
+  </w:abstractNum>
+  <w:abstractNum w:abstractNumId="5" w15:restartNumberingAfterBreak="0">
+    <w:nsid w:val="54FB762A"/>
+    <w:multiLevelType w:val="multilevel"/>
+    <w:tmpl w:val="FAB823EC"/>
+    <w:lvl w:ilvl="0">
+      <w:start w:val="1"/>
+      <w:numFmt w:val="bullet"/>
+      <w:lvlText w:val=""/>
+      <w:lvlJc w:val="left"/>
+      <w:pPr>
+        <w:tabs>
+          <w:tab w:val="num" w:pos="720"/>
+        </w:tabs>
+        <w:ind w:left="720" w:hanging="360"/>
+      </w:pPr>
+      <w:rPr>
+        <w:rFonts w:ascii="Symbol" w:hAnsi="Symbol" w:hint="default"/>
+        <w:sz w:val="20"/>
+      </w:rPr>
+    </w:lvl>
+    <w:lvl w:ilvl="1" w:tentative="1">
+      <w:start w:val="1"/>
+      <w:numFmt w:val="bullet"/>
+      <w:lvlText w:val=""/>
+      <w:lvlJc w:val="left"/>
+      <w:pPr>
+        <w:tabs>
+          <w:tab w:val="num" w:pos="1440"/>
+        </w:tabs>
+        <w:ind w:left="1440" w:hanging="360"/>
+      </w:pPr>
+      <w:rPr>
+        <w:rFonts w:ascii="Symbol" w:hAnsi="Symbol" w:hint="default"/>
+        <w:sz w:val="20"/>
+      </w:rPr>
+    </w:lvl>
+    <w:lvl w:ilvl="2" w:tentative="1">
+      <w:start w:val="1"/>
+      <w:numFmt w:val="bullet"/>
+      <w:lvlText w:val=""/>
+      <w:lvlJc w:val="left"/>
+      <w:pPr>
+        <w:tabs>
+          <w:tab w:val="num" w:pos="2160"/>
+        </w:tabs>
+        <w:ind w:left="2160" w:hanging="360"/>
+      </w:pPr>
+      <w:rPr>
+        <w:rFonts w:ascii="Symbol" w:hAnsi="Symbol" w:hint="default"/>
+        <w:sz w:val="20"/>
+      </w:rPr>
+    </w:lvl>
+    <w:lvl w:ilvl="3" w:tentative="1">
+      <w:start w:val="1"/>
+      <w:numFmt w:val="bullet"/>
+      <w:lvlText w:val=""/>
+      <w:lvlJc w:val="left"/>
+      <w:pPr>
+        <w:tabs>
+          <w:tab w:val="num" w:pos="2880"/>
+        </w:tabs>
+        <w:ind w:left="2880" w:hanging="360"/>
+      </w:pPr>
+      <w:rPr>
+        <w:rFonts w:ascii="Symbol" w:hAnsi="Symbol" w:hint="default"/>
+        <w:sz w:val="20"/>
+      </w:rPr>
+    </w:lvl>
+    <w:lvl w:ilvl="4" w:tentative="1">
+      <w:start w:val="1"/>
+      <w:numFmt w:val="bullet"/>
+      <w:lvlText w:val=""/>
+      <w:lvlJc w:val="left"/>
+      <w:pPr>
+        <w:tabs>
+          <w:tab w:val="num" w:pos="3600"/>
+        </w:tabs>
+        <w:ind w:left="3600" w:hanging="360"/>
+      </w:pPr>
+      <w:rPr>
+        <w:rFonts w:ascii="Symbol" w:hAnsi="Symbol" w:hint="default"/>
+        <w:sz w:val="20"/>
+      </w:rPr>
+    </w:lvl>
+    <w:lvl w:ilvl="5" w:tentative="1">
+      <w:start w:val="1"/>
+      <w:numFmt w:val="bullet"/>
+      <w:lvlText w:val=""/>
+      <w:lvlJc w:val="left"/>
+      <w:pPr>
+        <w:tabs>
+          <w:tab w:val="num" w:pos="4320"/>
+        </w:tabs>
+        <w:ind w:left="4320" w:hanging="360"/>
+      </w:pPr>
+      <w:rPr>
+        <w:rFonts w:ascii="Symbol" w:hAnsi="Symbol" w:hint="default"/>
+        <w:sz w:val="20"/>
+      </w:rPr>
+    </w:lvl>
+    <w:lvl w:ilvl="6" w:tentative="1">
+      <w:start w:val="1"/>
+      <w:numFmt w:val="bullet"/>
+      <w:lvlText w:val=""/>
+      <w:lvlJc w:val="left"/>
+      <w:pPr>
+        <w:tabs>
+          <w:tab w:val="num" w:pos="5040"/>
+        </w:tabs>
+        <w:ind w:left="5040" w:hanging="360"/>
+      </w:pPr>
+      <w:rPr>
+        <w:rFonts w:ascii="Symbol" w:hAnsi="Symbol" w:hint="default"/>
+        <w:sz w:val="20"/>
+      </w:rPr>
+    </w:lvl>
+    <w:lvl w:ilvl="7" w:tentative="1">
+      <w:start w:val="1"/>
+      <w:numFmt w:val="bullet"/>
+      <w:lvlText w:val=""/>
+      <w:lvlJc w:val="left"/>
+      <w:pPr>
+        <w:tabs>
+          <w:tab w:val="num" w:pos="5760"/>
+        </w:tabs>
+        <w:ind w:left="5760" w:hanging="360"/>
+      </w:pPr>
+      <w:rPr>
+        <w:rFonts w:ascii="Symbol" w:hAnsi="Symbol" w:hint="default"/>
+        <w:sz w:val="20"/>
+      </w:rPr>
+    </w:lvl>
+    <w:lvl w:ilvl="8" w:tentative="1">
+      <w:start w:val="1"/>
+      <w:numFmt w:val="bullet"/>
+      <w:lvlText w:val=""/>
+      <w:lvlJc w:val="left"/>
+      <w:pPr>
+        <w:tabs>
+          <w:tab w:val="num" w:pos="6480"/>
+        </w:tabs>
+        <w:ind w:left="6480" w:hanging="360"/>
+      </w:pPr>
+      <w:rPr>
+        <w:rFonts w:ascii="Symbol" w:hAnsi="Symbol" w:hint="default"/>
+        <w:sz w:val="20"/>
+      </w:rPr>
+    </w:lvl>
+  </w:abstractNum>
+  <w:abstractNum w:abstractNumId="6" w15:restartNumberingAfterBreak="0">
+    <w:nsid w:val="5A2B76C8"/>
+    <w:multiLevelType w:val="multilevel"/>
+    <w:tmpl w:val="4A38DAAE"/>
+    <w:lvl w:ilvl="0">
+      <w:start w:val="1"/>
+      <w:numFmt w:val="bullet"/>
+      <w:lvlText w:val=""/>
+      <w:lvlJc w:val="left"/>
+      <w:pPr>
+        <w:tabs>
+          <w:tab w:val="num" w:pos="720"/>
+        </w:tabs>
+        <w:ind w:left="720" w:hanging="360"/>
+      </w:pPr>
+      <w:rPr>
+        <w:rFonts w:ascii="Symbol" w:hAnsi="Symbol" w:hint="default"/>
+        <w:sz w:val="20"/>
+      </w:rPr>
+    </w:lvl>
+    <w:lvl w:ilvl="1" w:tentative="1">
+      <w:start w:val="1"/>
+      <w:numFmt w:val="bullet"/>
+      <w:lvlText w:val=""/>
+      <w:lvlJc w:val="left"/>
+      <w:pPr>
+        <w:tabs>
+          <w:tab w:val="num" w:pos="1440"/>
+        </w:tabs>
+        <w:ind w:left="1440" w:hanging="360"/>
+      </w:pPr>
+      <w:rPr>
+        <w:rFonts w:ascii="Symbol" w:hAnsi="Symbol" w:hint="default"/>
+        <w:sz w:val="20"/>
+      </w:rPr>
+    </w:lvl>
+    <w:lvl w:ilvl="2" w:tentative="1">
+      <w:start w:val="1"/>
+      <w:numFmt w:val="bullet"/>
+      <w:lvlText w:val=""/>
+      <w:lvlJc w:val="left"/>
+      <w:pPr>
+        <w:tabs>
+          <w:tab w:val="num" w:pos="2160"/>
+        </w:tabs>
+        <w:ind w:left="2160" w:hanging="360"/>
+      </w:pPr>
+      <w:rPr>
+        <w:rFonts w:ascii="Symbol" w:hAnsi="Symbol" w:hint="default"/>
+        <w:sz w:val="20"/>
+      </w:rPr>
+    </w:lvl>
+    <w:lvl w:ilvl="3" w:tentative="1">
+      <w:start w:val="1"/>
+      <w:numFmt w:val="bullet"/>
+      <w:lvlText w:val=""/>
+      <w:lvlJc w:val="left"/>
+      <w:pPr>
+        <w:tabs>
+          <w:tab w:val="num" w:pos="2880"/>
+        </w:tabs>
+        <w:ind w:left="2880" w:hanging="360"/>
+      </w:pPr>
+      <w:rPr>
+        <w:rFonts w:ascii="Symbol" w:hAnsi="Symbol" w:hint="default"/>
+        <w:sz w:val="20"/>
+      </w:rPr>
+    </w:lvl>
+    <w:lvl w:ilvl="4" w:tentative="1">
+      <w:start w:val="1"/>
+      <w:numFmt w:val="bullet"/>
+      <w:lvlText w:val=""/>
+      <w:lvlJc w:val="left"/>
+      <w:pPr>
+        <w:tabs>
+          <w:tab w:val="num" w:pos="3600"/>
+        </w:tabs>
+        <w:ind w:left="3600" w:hanging="360"/>
+      </w:pPr>
+      <w:rPr>
+        <w:rFonts w:ascii="Symbol" w:hAnsi="Symbol" w:hint="default"/>
+        <w:sz w:val="20"/>
+      </w:rPr>
+    </w:lvl>
+    <w:lvl w:ilvl="5" w:tentative="1">
+      <w:start w:val="1"/>
+      <w:numFmt w:val="bullet"/>
+      <w:lvlText w:val=""/>
+      <w:lvlJc w:val="left"/>
+      <w:pPr>
+        <w:tabs>
+          <w:tab w:val="num" w:pos="4320"/>
+        </w:tabs>
+        <w:ind w:left="4320" w:hanging="360"/>
+      </w:pPr>
+      <w:rPr>
+        <w:rFonts w:ascii="Symbol" w:hAnsi="Symbol" w:hint="default"/>
+        <w:sz w:val="20"/>
+      </w:rPr>
+    </w:lvl>
+    <w:lvl w:ilvl="6" w:tentative="1">
+      <w:start w:val="1"/>
+      <w:numFmt w:val="bullet"/>
+      <w:lvlText w:val=""/>
+      <w:lvlJc w:val="left"/>
+      <w:pPr>
+        <w:tabs>
+          <w:tab w:val="num" w:pos="5040"/>
+        </w:tabs>
+        <w:ind w:left="5040" w:hanging="360"/>
+      </w:pPr>
+      <w:rPr>
+        <w:rFonts w:ascii="Symbol" w:hAnsi="Symbol" w:hint="default"/>
+        <w:sz w:val="20"/>
+      </w:rPr>
+    </w:lvl>
+    <w:lvl w:ilvl="7" w:tentative="1">
+      <w:start w:val="1"/>
+      <w:numFmt w:val="bullet"/>
+      <w:lvlText w:val=""/>
+      <w:lvlJc w:val="left"/>
+      <w:pPr>
+        <w:tabs>
+          <w:tab w:val="num" w:pos="5760"/>
+        </w:tabs>
+        <w:ind w:left="5760" w:hanging="360"/>
+      </w:pPr>
+      <w:rPr>
+        <w:rFonts w:ascii="Symbol" w:hAnsi="Symbol" w:hint="default"/>
+        <w:sz w:val="20"/>
+      </w:rPr>
+    </w:lvl>
+    <w:lvl w:ilvl="8" w:tentative="1">
+      <w:start w:val="1"/>
+      <w:numFmt w:val="bullet"/>
+      <w:lvlText w:val=""/>
+      <w:lvlJc w:val="left"/>
+      <w:pPr>
+        <w:tabs>
+          <w:tab w:val="num" w:pos="6480"/>
+        </w:tabs>
+        <w:ind w:left="6480" w:hanging="360"/>
+      </w:pPr>
+      <w:rPr>
+        <w:rFonts w:ascii="Symbol" w:hAnsi="Symbol" w:hint="default"/>
+        <w:sz w:val="20"/>
+      </w:rPr>
+    </w:lvl>
+  </w:abstractNum>
+  <w:abstractNum w:abstractNumId="7" w15:restartNumberingAfterBreak="0">
+    <w:nsid w:val="5CB0284C"/>
+    <w:multiLevelType w:val="multilevel"/>
+    <w:tmpl w:val="4948E72E"/>
+    <w:lvl w:ilvl="0">
+      <w:start w:val="1"/>
+      <w:numFmt w:val="bullet"/>
+      <w:lvlText w:val=""/>
+      <w:lvlJc w:val="left"/>
+      <w:pPr>
+        <w:tabs>
+          <w:tab w:val="num" w:pos="720"/>
+        </w:tabs>
+        <w:ind w:left="720" w:hanging="360"/>
+      </w:pPr>
+      <w:rPr>
+        <w:rFonts w:ascii="Symbol" w:hAnsi="Symbol" w:hint="default"/>
+        <w:sz w:val="20"/>
+      </w:rPr>
+    </w:lvl>
+    <w:lvl w:ilvl="1" w:tentative="1">
+      <w:start w:val="1"/>
+      <w:numFmt w:val="bullet"/>
+      <w:lvlText w:val=""/>
+      <w:lvlJc w:val="left"/>
+      <w:pPr>
+        <w:tabs>
+          <w:tab w:val="num" w:pos="1440"/>
+        </w:tabs>
+        <w:ind w:left="1440" w:hanging="360"/>
+      </w:pPr>
+      <w:rPr>
+        <w:rFonts w:ascii="Symbol" w:hAnsi="Symbol" w:hint="default"/>
+        <w:sz w:val="20"/>
+      </w:rPr>
+    </w:lvl>
+    <w:lvl w:ilvl="2" w:tentative="1">
+      <w:start w:val="1"/>
+      <w:numFmt w:val="bullet"/>
+      <w:lvlText w:val=""/>
+      <w:lvlJc w:val="left"/>
+      <w:pPr>
+        <w:tabs>
+          <w:tab w:val="num" w:pos="2160"/>
+        </w:tabs>
+        <w:ind w:left="2160" w:hanging="360"/>
+      </w:pPr>
+      <w:rPr>
+        <w:rFonts w:ascii="Symbol" w:hAnsi="Symbol" w:hint="default"/>
+        <w:sz w:val="20"/>
+      </w:rPr>
+    </w:lvl>
+    <w:lvl w:ilvl="3" w:tentative="1">
+      <w:start w:val="1"/>
+      <w:numFmt w:val="bullet"/>
+      <w:lvlText w:val=""/>
+      <w:lvlJc w:val="left"/>
+      <w:pPr>
+        <w:tabs>
+          <w:tab w:val="num" w:pos="2880"/>
+        </w:tabs>
+        <w:ind w:left="2880" w:hanging="360"/>
+      </w:pPr>
+      <w:rPr>
+        <w:rFonts w:ascii="Symbol" w:hAnsi="Symbol" w:hint="default"/>
+        <w:sz w:val="20"/>
+      </w:rPr>
+    </w:lvl>
+    <w:lvl w:ilvl="4" w:tentative="1">
+      <w:start w:val="1"/>
+      <w:numFmt w:val="bullet"/>
+      <w:lvlText w:val=""/>
+      <w:lvlJc w:val="left"/>
+      <w:pPr>
+        <w:tabs>
+          <w:tab w:val="num" w:pos="3600"/>
+        </w:tabs>
+        <w:ind w:left="3600" w:hanging="360"/>
+      </w:pPr>
+      <w:rPr>
+        <w:rFonts w:ascii="Symbol" w:hAnsi="Symbol" w:hint="default"/>
+        <w:sz w:val="20"/>
+      </w:rPr>
+    </w:lvl>
+    <w:lvl w:ilvl="5" w:tentative="1">
+      <w:start w:val="1"/>
+      <w:numFmt w:val="bullet"/>
+      <w:lvlText w:val=""/>
+      <w:lvlJc w:val="left"/>
+      <w:pPr>
+        <w:tabs>
+          <w:tab w:val="num" w:pos="4320"/>
+        </w:tabs>
+        <w:ind w:left="4320" w:hanging="360"/>
+      </w:pPr>
+      <w:rPr>
+        <w:rFonts w:ascii="Symbol" w:hAnsi="Symbol" w:hint="default"/>
+        <w:sz w:val="20"/>
+      </w:rPr>
+    </w:lvl>
+    <w:lvl w:ilvl="6" w:tentative="1">
+      <w:start w:val="1"/>
+      <w:numFmt w:val="bullet"/>
+      <w:lvlText w:val=""/>
+      <w:lvlJc w:val="left"/>
+      <w:pPr>
+        <w:tabs>
+          <w:tab w:val="num" w:pos="5040"/>
+        </w:tabs>
+        <w:ind w:left="5040" w:hanging="360"/>
+      </w:pPr>
+      <w:rPr>
+        <w:rFonts w:ascii="Symbol" w:hAnsi="Symbol" w:hint="default"/>
+        <w:sz w:val="20"/>
+      </w:rPr>
+    </w:lvl>
+    <w:lvl w:ilvl="7" w:tentative="1">
+      <w:start w:val="1"/>
+      <w:numFmt w:val="bullet"/>
+      <w:lvlText w:val=""/>
+      <w:lvlJc w:val="left"/>
+      <w:pPr>
+        <w:tabs>
+          <w:tab w:val="num" w:pos="5760"/>
+        </w:tabs>
+        <w:ind w:left="5760" w:hanging="360"/>
+      </w:pPr>
+      <w:rPr>
+        <w:rFonts w:ascii="Symbol" w:hAnsi="Symbol" w:hint="default"/>
+        <w:sz w:val="20"/>
+      </w:rPr>
+    </w:lvl>
+    <w:lvl w:ilvl="8" w:tentative="1">
+      <w:start w:val="1"/>
+      <w:numFmt w:val="bullet"/>
+      <w:lvlText w:val=""/>
+      <w:lvlJc w:val="left"/>
+      <w:pPr>
+        <w:tabs>
+          <w:tab w:val="num" w:pos="6480"/>
+        </w:tabs>
+        <w:ind w:left="6480" w:hanging="360"/>
+      </w:pPr>
+      <w:rPr>
+        <w:rFonts w:ascii="Symbol" w:hAnsi="Symbol" w:hint="default"/>
+        <w:sz w:val="20"/>
+      </w:rPr>
+    </w:lvl>
+  </w:abstractNum>
+  <w:abstractNum w:abstractNumId="8" w15:restartNumberingAfterBreak="0">
+    <w:nsid w:val="69110BAC"/>
+    <w:multiLevelType w:val="multilevel"/>
+    <w:tmpl w:val="0B0E97A4"/>
+    <w:lvl w:ilvl="0">
+      <w:start w:val="1"/>
+      <w:numFmt w:val="bullet"/>
+      <w:lvlText w:val=""/>
+      <w:lvlJc w:val="left"/>
+      <w:pPr>
+        <w:tabs>
+          <w:tab w:val="num" w:pos="720"/>
+        </w:tabs>
+        <w:ind w:left="720" w:hanging="360"/>
+      </w:pPr>
+      <w:rPr>
+        <w:rFonts w:ascii="Symbol" w:hAnsi="Symbol" w:hint="default"/>
+        <w:sz w:val="20"/>
+      </w:rPr>
+    </w:lvl>
+    <w:lvl w:ilvl="1" w:tentative="1">
+      <w:start w:val="1"/>
+      <w:numFmt w:val="bullet"/>
+      <w:lvlText w:val=""/>
+      <w:lvlJc w:val="left"/>
+      <w:pPr>
+        <w:tabs>
+          <w:tab w:val="num" w:pos="1440"/>
+        </w:tabs>
+        <w:ind w:left="1440" w:hanging="360"/>
+      </w:pPr>
+      <w:rPr>
+        <w:rFonts w:ascii="Symbol" w:hAnsi="Symbol" w:hint="default"/>
+        <w:sz w:val="20"/>
+      </w:rPr>
+    </w:lvl>
+    <w:lvl w:ilvl="2" w:tentative="1">
+      <w:start w:val="1"/>
+      <w:numFmt w:val="bullet"/>
+      <w:lvlText w:val=""/>
+      <w:lvlJc w:val="left"/>
+      <w:pPr>
+        <w:tabs>
+          <w:tab w:val="num" w:pos="2160"/>
+        </w:tabs>
+        <w:ind w:left="2160" w:hanging="360"/>
+      </w:pPr>
+      <w:rPr>
+        <w:rFonts w:ascii="Symbol" w:hAnsi="Symbol" w:hint="default"/>
+        <w:sz w:val="20"/>
+      </w:rPr>
+    </w:lvl>
+    <w:lvl w:ilvl="3" w:tentative="1">
+      <w:start w:val="1"/>
+      <w:numFmt w:val="bullet"/>
+      <w:lvlText w:val=""/>
+      <w:lvlJc w:val="left"/>
+      <w:pPr>
+        <w:tabs>
+          <w:tab w:val="num" w:pos="2880"/>
+        </w:tabs>
+        <w:ind w:left="2880" w:hanging="360"/>
+      </w:pPr>
+      <w:rPr>
+        <w:rFonts w:ascii="Symbol" w:hAnsi="Symbol" w:hint="default"/>
+        <w:sz w:val="20"/>
+      </w:rPr>
+    </w:lvl>
+    <w:lvl w:ilvl="4" w:tentative="1">
+      <w:start w:val="1"/>
+      <w:numFmt w:val="bullet"/>
+      <w:lvlText w:val=""/>
+      <w:lvlJc w:val="left"/>
+      <w:pPr>
+        <w:tabs>
+          <w:tab w:val="num" w:pos="3600"/>
+        </w:tabs>
+        <w:ind w:left="3600" w:hanging="360"/>
+      </w:pPr>
+      <w:rPr>
+        <w:rFonts w:ascii="Symbol" w:hAnsi="Symbol" w:hint="default"/>
+        <w:sz w:val="20"/>
+      </w:rPr>
+    </w:lvl>
+    <w:lvl w:ilvl="5" w:tentative="1">
+      <w:start w:val="1"/>
+      <w:numFmt w:val="bullet"/>
+      <w:lvlText w:val=""/>
+      <w:lvlJc w:val="left"/>
+      <w:pPr>
+        <w:tabs>
+          <w:tab w:val="num" w:pos="4320"/>
+        </w:tabs>
+        <w:ind w:left="4320" w:hanging="360"/>
+      </w:pPr>
+      <w:rPr>
+        <w:rFonts w:ascii="Symbol" w:hAnsi="Symbol" w:hint="default"/>
+        <w:sz w:val="20"/>
+      </w:rPr>
+    </w:lvl>
+    <w:lvl w:ilvl="6" w:tentative="1">
+      <w:start w:val="1"/>
+      <w:numFmt w:val="bullet"/>
+      <w:lvlText w:val=""/>
+      <w:lvlJc w:val="left"/>
+      <w:pPr>
+        <w:tabs>
+          <w:tab w:val="num" w:pos="5040"/>
+        </w:tabs>
+        <w:ind w:left="5040" w:hanging="360"/>
+      </w:pPr>
+      <w:rPr>
+        <w:rFonts w:ascii="Symbol" w:hAnsi="Symbol" w:hint="default"/>
+        <w:sz w:val="20"/>
+      </w:rPr>
+    </w:lvl>
+    <w:lvl w:ilvl="7" w:tentative="1">
+      <w:start w:val="1"/>
+      <w:numFmt w:val="bullet"/>
+      <w:lvlText w:val=""/>
+      <w:lvlJc w:val="left"/>
+      <w:pPr>
+        <w:tabs>
+          <w:tab w:val="num" w:pos="5760"/>
+        </w:tabs>
+        <w:ind w:left="5760" w:hanging="360"/>
+      </w:pPr>
+      <w:rPr>
+        <w:rFonts w:ascii="Symbol" w:hAnsi="Symbol" w:hint="default"/>
+        <w:sz w:val="20"/>
+      </w:rPr>
+    </w:lvl>
+    <w:lvl w:ilvl="8" w:tentative="1">
+      <w:start w:val="1"/>
+      <w:numFmt w:val="bullet"/>
+      <w:lvlText w:val=""/>
+      <w:lvlJc w:val="left"/>
+      <w:pPr>
+        <w:tabs>
+          <w:tab w:val="num" w:pos="6480"/>
+        </w:tabs>
+        <w:ind w:left="6480" w:hanging="360"/>
+      </w:pPr>
+      <w:rPr>
+        <w:rFonts w:ascii="Symbol" w:hAnsi="Symbol" w:hint="default"/>
+        <w:sz w:val="20"/>
+      </w:rPr>
+    </w:lvl>
+  </w:abstractNum>
+  <w:abstractNum w:abstractNumId="9" w15:restartNumberingAfterBreak="0">
     <w:nsid w:val="75CA086E"/>
     <w:multiLevelType w:val="multilevel"/>
     <w:tmpl w:val="0DDC188E"/>
@@ -544,7 +2770,642 @@
       </w:rPr>
     </w:lvl>
   </w:abstractNum>
+  <w:abstractNum w:abstractNumId="10" w15:restartNumberingAfterBreak="0">
+    <w:nsid w:val="769E52EA"/>
+    <w:multiLevelType w:val="multilevel"/>
+    <w:tmpl w:val="2C3A031C"/>
+    <w:lvl w:ilvl="0">
+      <w:start w:val="1"/>
+      <w:numFmt w:val="bullet"/>
+      <w:lvlText w:val=""/>
+      <w:lvlJc w:val="left"/>
+      <w:pPr>
+        <w:tabs>
+          <w:tab w:val="num" w:pos="720"/>
+        </w:tabs>
+        <w:ind w:left="720" w:hanging="360"/>
+      </w:pPr>
+      <w:rPr>
+        <w:rFonts w:ascii="Symbol" w:hAnsi="Symbol" w:hint="default"/>
+        <w:sz w:val="20"/>
+      </w:rPr>
+    </w:lvl>
+    <w:lvl w:ilvl="1" w:tentative="1">
+      <w:start w:val="1"/>
+      <w:numFmt w:val="bullet"/>
+      <w:lvlText w:val=""/>
+      <w:lvlJc w:val="left"/>
+      <w:pPr>
+        <w:tabs>
+          <w:tab w:val="num" w:pos="1440"/>
+        </w:tabs>
+        <w:ind w:left="1440" w:hanging="360"/>
+      </w:pPr>
+      <w:rPr>
+        <w:rFonts w:ascii="Symbol" w:hAnsi="Symbol" w:hint="default"/>
+        <w:sz w:val="20"/>
+      </w:rPr>
+    </w:lvl>
+    <w:lvl w:ilvl="2" w:tentative="1">
+      <w:start w:val="1"/>
+      <w:numFmt w:val="bullet"/>
+      <w:lvlText w:val=""/>
+      <w:lvlJc w:val="left"/>
+      <w:pPr>
+        <w:tabs>
+          <w:tab w:val="num" w:pos="2160"/>
+        </w:tabs>
+        <w:ind w:left="2160" w:hanging="360"/>
+      </w:pPr>
+      <w:rPr>
+        <w:rFonts w:ascii="Symbol" w:hAnsi="Symbol" w:hint="default"/>
+        <w:sz w:val="20"/>
+      </w:rPr>
+    </w:lvl>
+    <w:lvl w:ilvl="3" w:tentative="1">
+      <w:start w:val="1"/>
+      <w:numFmt w:val="bullet"/>
+      <w:lvlText w:val=""/>
+      <w:lvlJc w:val="left"/>
+      <w:pPr>
+        <w:tabs>
+          <w:tab w:val="num" w:pos="2880"/>
+        </w:tabs>
+        <w:ind w:left="2880" w:hanging="360"/>
+      </w:pPr>
+      <w:rPr>
+        <w:rFonts w:ascii="Symbol" w:hAnsi="Symbol" w:hint="default"/>
+        <w:sz w:val="20"/>
+      </w:rPr>
+    </w:lvl>
+    <w:lvl w:ilvl="4" w:tentative="1">
+      <w:start w:val="1"/>
+      <w:numFmt w:val="bullet"/>
+      <w:lvlText w:val=""/>
+      <w:lvlJc w:val="left"/>
+      <w:pPr>
+        <w:tabs>
+          <w:tab w:val="num" w:pos="3600"/>
+        </w:tabs>
+        <w:ind w:left="3600" w:hanging="360"/>
+      </w:pPr>
+      <w:rPr>
+        <w:rFonts w:ascii="Symbol" w:hAnsi="Symbol" w:hint="default"/>
+        <w:sz w:val="20"/>
+      </w:rPr>
+    </w:lvl>
+    <w:lvl w:ilvl="5" w:tentative="1">
+      <w:start w:val="1"/>
+      <w:numFmt w:val="bullet"/>
+      <w:lvlText w:val=""/>
+      <w:lvlJc w:val="left"/>
+      <w:pPr>
+        <w:tabs>
+          <w:tab w:val="num" w:pos="4320"/>
+        </w:tabs>
+        <w:ind w:left="4320" w:hanging="360"/>
+      </w:pPr>
+      <w:rPr>
+        <w:rFonts w:ascii="Symbol" w:hAnsi="Symbol" w:hint="default"/>
+        <w:sz w:val="20"/>
+      </w:rPr>
+    </w:lvl>
+    <w:lvl w:ilvl="6" w:tentative="1">
+      <w:start w:val="1"/>
+      <w:numFmt w:val="bullet"/>
+      <w:lvlText w:val=""/>
+      <w:lvlJc w:val="left"/>
+      <w:pPr>
+        <w:tabs>
+          <w:tab w:val="num" w:pos="5040"/>
+        </w:tabs>
+        <w:ind w:left="5040" w:hanging="360"/>
+      </w:pPr>
+      <w:rPr>
+        <w:rFonts w:ascii="Symbol" w:hAnsi="Symbol" w:hint="default"/>
+        <w:sz w:val="20"/>
+      </w:rPr>
+    </w:lvl>
+    <w:lvl w:ilvl="7" w:tentative="1">
+      <w:start w:val="1"/>
+      <w:numFmt w:val="bullet"/>
+      <w:lvlText w:val=""/>
+      <w:lvlJc w:val="left"/>
+      <w:pPr>
+        <w:tabs>
+          <w:tab w:val="num" w:pos="5760"/>
+        </w:tabs>
+        <w:ind w:left="5760" w:hanging="360"/>
+      </w:pPr>
+      <w:rPr>
+        <w:rFonts w:ascii="Symbol" w:hAnsi="Symbol" w:hint="default"/>
+        <w:sz w:val="20"/>
+      </w:rPr>
+    </w:lvl>
+    <w:lvl w:ilvl="8" w:tentative="1">
+      <w:start w:val="1"/>
+      <w:numFmt w:val="bullet"/>
+      <w:lvlText w:val=""/>
+      <w:lvlJc w:val="left"/>
+      <w:pPr>
+        <w:tabs>
+          <w:tab w:val="num" w:pos="6480"/>
+        </w:tabs>
+        <w:ind w:left="6480" w:hanging="360"/>
+      </w:pPr>
+      <w:rPr>
+        <w:rFonts w:ascii="Symbol" w:hAnsi="Symbol" w:hint="default"/>
+        <w:sz w:val="20"/>
+      </w:rPr>
+    </w:lvl>
+  </w:abstractNum>
+  <w:abstractNum w:abstractNumId="11" w15:restartNumberingAfterBreak="0">
+    <w:nsid w:val="78825960"/>
+    <w:multiLevelType w:val="multilevel"/>
+    <w:tmpl w:val="0700CC5A"/>
+    <w:lvl w:ilvl="0">
+      <w:start w:val="1"/>
+      <w:numFmt w:val="bullet"/>
+      <w:lvlText w:val=""/>
+      <w:lvlJc w:val="left"/>
+      <w:pPr>
+        <w:tabs>
+          <w:tab w:val="num" w:pos="720"/>
+        </w:tabs>
+        <w:ind w:left="720" w:hanging="360"/>
+      </w:pPr>
+      <w:rPr>
+        <w:rFonts w:ascii="Symbol" w:hAnsi="Symbol" w:hint="default"/>
+        <w:sz w:val="20"/>
+      </w:rPr>
+    </w:lvl>
+    <w:lvl w:ilvl="1" w:tentative="1">
+      <w:start w:val="1"/>
+      <w:numFmt w:val="bullet"/>
+      <w:lvlText w:val=""/>
+      <w:lvlJc w:val="left"/>
+      <w:pPr>
+        <w:tabs>
+          <w:tab w:val="num" w:pos="1440"/>
+        </w:tabs>
+        <w:ind w:left="1440" w:hanging="360"/>
+      </w:pPr>
+      <w:rPr>
+        <w:rFonts w:ascii="Symbol" w:hAnsi="Symbol" w:hint="default"/>
+        <w:sz w:val="20"/>
+      </w:rPr>
+    </w:lvl>
+    <w:lvl w:ilvl="2" w:tentative="1">
+      <w:start w:val="1"/>
+      <w:numFmt w:val="bullet"/>
+      <w:lvlText w:val=""/>
+      <w:lvlJc w:val="left"/>
+      <w:pPr>
+        <w:tabs>
+          <w:tab w:val="num" w:pos="2160"/>
+        </w:tabs>
+        <w:ind w:left="2160" w:hanging="360"/>
+      </w:pPr>
+      <w:rPr>
+        <w:rFonts w:ascii="Symbol" w:hAnsi="Symbol" w:hint="default"/>
+        <w:sz w:val="20"/>
+      </w:rPr>
+    </w:lvl>
+    <w:lvl w:ilvl="3" w:tentative="1">
+      <w:start w:val="1"/>
+      <w:numFmt w:val="bullet"/>
+      <w:lvlText w:val=""/>
+      <w:lvlJc w:val="left"/>
+      <w:pPr>
+        <w:tabs>
+          <w:tab w:val="num" w:pos="2880"/>
+        </w:tabs>
+        <w:ind w:left="2880" w:hanging="360"/>
+      </w:pPr>
+      <w:rPr>
+        <w:rFonts w:ascii="Symbol" w:hAnsi="Symbol" w:hint="default"/>
+        <w:sz w:val="20"/>
+      </w:rPr>
+    </w:lvl>
+    <w:lvl w:ilvl="4" w:tentative="1">
+      <w:start w:val="1"/>
+      <w:numFmt w:val="bullet"/>
+      <w:lvlText w:val=""/>
+      <w:lvlJc w:val="left"/>
+      <w:pPr>
+        <w:tabs>
+          <w:tab w:val="num" w:pos="3600"/>
+        </w:tabs>
+        <w:ind w:left="3600" w:hanging="360"/>
+      </w:pPr>
+      <w:rPr>
+        <w:rFonts w:ascii="Symbol" w:hAnsi="Symbol" w:hint="default"/>
+        <w:sz w:val="20"/>
+      </w:rPr>
+    </w:lvl>
+    <w:lvl w:ilvl="5" w:tentative="1">
+      <w:start w:val="1"/>
+      <w:numFmt w:val="bullet"/>
+      <w:lvlText w:val=""/>
+      <w:lvlJc w:val="left"/>
+      <w:pPr>
+        <w:tabs>
+          <w:tab w:val="num" w:pos="4320"/>
+        </w:tabs>
+        <w:ind w:left="4320" w:hanging="360"/>
+      </w:pPr>
+      <w:rPr>
+        <w:rFonts w:ascii="Symbol" w:hAnsi="Symbol" w:hint="default"/>
+        <w:sz w:val="20"/>
+      </w:rPr>
+    </w:lvl>
+    <w:lvl w:ilvl="6" w:tentative="1">
+      <w:start w:val="1"/>
+      <w:numFmt w:val="bullet"/>
+      <w:lvlText w:val=""/>
+      <w:lvlJc w:val="left"/>
+      <w:pPr>
+        <w:tabs>
+          <w:tab w:val="num" w:pos="5040"/>
+        </w:tabs>
+        <w:ind w:left="5040" w:hanging="360"/>
+      </w:pPr>
+      <w:rPr>
+        <w:rFonts w:ascii="Symbol" w:hAnsi="Symbol" w:hint="default"/>
+        <w:sz w:val="20"/>
+      </w:rPr>
+    </w:lvl>
+    <w:lvl w:ilvl="7" w:tentative="1">
+      <w:start w:val="1"/>
+      <w:numFmt w:val="bullet"/>
+      <w:lvlText w:val=""/>
+      <w:lvlJc w:val="left"/>
+      <w:pPr>
+        <w:tabs>
+          <w:tab w:val="num" w:pos="5760"/>
+        </w:tabs>
+        <w:ind w:left="5760" w:hanging="360"/>
+      </w:pPr>
+      <w:rPr>
+        <w:rFonts w:ascii="Symbol" w:hAnsi="Symbol" w:hint="default"/>
+        <w:sz w:val="20"/>
+      </w:rPr>
+    </w:lvl>
+    <w:lvl w:ilvl="8" w:tentative="1">
+      <w:start w:val="1"/>
+      <w:numFmt w:val="bullet"/>
+      <w:lvlText w:val=""/>
+      <w:lvlJc w:val="left"/>
+      <w:pPr>
+        <w:tabs>
+          <w:tab w:val="num" w:pos="6480"/>
+        </w:tabs>
+        <w:ind w:left="6480" w:hanging="360"/>
+      </w:pPr>
+      <w:rPr>
+        <w:rFonts w:ascii="Symbol" w:hAnsi="Symbol" w:hint="default"/>
+        <w:sz w:val="20"/>
+      </w:rPr>
+    </w:lvl>
+  </w:abstractNum>
+  <w:abstractNum w:abstractNumId="12" w15:restartNumberingAfterBreak="0">
+    <w:nsid w:val="7BD33191"/>
+    <w:multiLevelType w:val="multilevel"/>
+    <w:tmpl w:val="853CB9A6"/>
+    <w:lvl w:ilvl="0">
+      <w:start w:val="1"/>
+      <w:numFmt w:val="bullet"/>
+      <w:lvlText w:val=""/>
+      <w:lvlJc w:val="left"/>
+      <w:pPr>
+        <w:tabs>
+          <w:tab w:val="num" w:pos="720"/>
+        </w:tabs>
+        <w:ind w:left="720" w:hanging="360"/>
+      </w:pPr>
+      <w:rPr>
+        <w:rFonts w:ascii="Symbol" w:hAnsi="Symbol" w:hint="default"/>
+        <w:sz w:val="20"/>
+      </w:rPr>
+    </w:lvl>
+    <w:lvl w:ilvl="1" w:tentative="1">
+      <w:start w:val="1"/>
+      <w:numFmt w:val="bullet"/>
+      <w:lvlText w:val=""/>
+      <w:lvlJc w:val="left"/>
+      <w:pPr>
+        <w:tabs>
+          <w:tab w:val="num" w:pos="1440"/>
+        </w:tabs>
+        <w:ind w:left="1440" w:hanging="360"/>
+      </w:pPr>
+      <w:rPr>
+        <w:rFonts w:ascii="Symbol" w:hAnsi="Symbol" w:hint="default"/>
+        <w:sz w:val="20"/>
+      </w:rPr>
+    </w:lvl>
+    <w:lvl w:ilvl="2" w:tentative="1">
+      <w:start w:val="1"/>
+      <w:numFmt w:val="bullet"/>
+      <w:lvlText w:val=""/>
+      <w:lvlJc w:val="left"/>
+      <w:pPr>
+        <w:tabs>
+          <w:tab w:val="num" w:pos="2160"/>
+        </w:tabs>
+        <w:ind w:left="2160" w:hanging="360"/>
+      </w:pPr>
+      <w:rPr>
+        <w:rFonts w:ascii="Symbol" w:hAnsi="Symbol" w:hint="default"/>
+        <w:sz w:val="20"/>
+      </w:rPr>
+    </w:lvl>
+    <w:lvl w:ilvl="3" w:tentative="1">
+      <w:start w:val="1"/>
+      <w:numFmt w:val="bullet"/>
+      <w:lvlText w:val=""/>
+      <w:lvlJc w:val="left"/>
+      <w:pPr>
+        <w:tabs>
+          <w:tab w:val="num" w:pos="2880"/>
+        </w:tabs>
+        <w:ind w:left="2880" w:hanging="360"/>
+      </w:pPr>
+      <w:rPr>
+        <w:rFonts w:ascii="Symbol" w:hAnsi="Symbol" w:hint="default"/>
+        <w:sz w:val="20"/>
+      </w:rPr>
+    </w:lvl>
+    <w:lvl w:ilvl="4" w:tentative="1">
+      <w:start w:val="1"/>
+      <w:numFmt w:val="bullet"/>
+      <w:lvlText w:val=""/>
+      <w:lvlJc w:val="left"/>
+      <w:pPr>
+        <w:tabs>
+          <w:tab w:val="num" w:pos="3600"/>
+        </w:tabs>
+        <w:ind w:left="3600" w:hanging="360"/>
+      </w:pPr>
+      <w:rPr>
+        <w:rFonts w:ascii="Symbol" w:hAnsi="Symbol" w:hint="default"/>
+        <w:sz w:val="20"/>
+      </w:rPr>
+    </w:lvl>
+    <w:lvl w:ilvl="5" w:tentative="1">
+      <w:start w:val="1"/>
+      <w:numFmt w:val="bullet"/>
+      <w:lvlText w:val=""/>
+      <w:lvlJc w:val="left"/>
+      <w:pPr>
+        <w:tabs>
+          <w:tab w:val="num" w:pos="4320"/>
+        </w:tabs>
+        <w:ind w:left="4320" w:hanging="360"/>
+      </w:pPr>
+      <w:rPr>
+        <w:rFonts w:ascii="Symbol" w:hAnsi="Symbol" w:hint="default"/>
+        <w:sz w:val="20"/>
+      </w:rPr>
+    </w:lvl>
+    <w:lvl w:ilvl="6" w:tentative="1">
+      <w:start w:val="1"/>
+      <w:numFmt w:val="bullet"/>
+      <w:lvlText w:val=""/>
+      <w:lvlJc w:val="left"/>
+      <w:pPr>
+        <w:tabs>
+          <w:tab w:val="num" w:pos="5040"/>
+        </w:tabs>
+        <w:ind w:left="5040" w:hanging="360"/>
+      </w:pPr>
+      <w:rPr>
+        <w:rFonts w:ascii="Symbol" w:hAnsi="Symbol" w:hint="default"/>
+        <w:sz w:val="20"/>
+      </w:rPr>
+    </w:lvl>
+    <w:lvl w:ilvl="7" w:tentative="1">
+      <w:start w:val="1"/>
+      <w:numFmt w:val="bullet"/>
+      <w:lvlText w:val=""/>
+      <w:lvlJc w:val="left"/>
+      <w:pPr>
+        <w:tabs>
+          <w:tab w:val="num" w:pos="5760"/>
+        </w:tabs>
+        <w:ind w:left="5760" w:hanging="360"/>
+      </w:pPr>
+      <w:rPr>
+        <w:rFonts w:ascii="Symbol" w:hAnsi="Symbol" w:hint="default"/>
+        <w:sz w:val="20"/>
+      </w:rPr>
+    </w:lvl>
+    <w:lvl w:ilvl="8" w:tentative="1">
+      <w:start w:val="1"/>
+      <w:numFmt w:val="bullet"/>
+      <w:lvlText w:val=""/>
+      <w:lvlJc w:val="left"/>
+      <w:pPr>
+        <w:tabs>
+          <w:tab w:val="num" w:pos="6480"/>
+        </w:tabs>
+        <w:ind w:left="6480" w:hanging="360"/>
+      </w:pPr>
+      <w:rPr>
+        <w:rFonts w:ascii="Symbol" w:hAnsi="Symbol" w:hint="default"/>
+        <w:sz w:val="20"/>
+      </w:rPr>
+    </w:lvl>
+  </w:abstractNum>
+  <w:abstractNum w:abstractNumId="13" w15:restartNumberingAfterBreak="0">
+    <w:nsid w:val="7CB33AD4"/>
+    <w:multiLevelType w:val="multilevel"/>
+    <w:tmpl w:val="0A62938A"/>
+    <w:lvl w:ilvl="0">
+      <w:start w:val="1"/>
+      <w:numFmt w:val="bullet"/>
+      <w:lvlText w:val=""/>
+      <w:lvlJc w:val="left"/>
+      <w:pPr>
+        <w:tabs>
+          <w:tab w:val="num" w:pos="720"/>
+        </w:tabs>
+        <w:ind w:left="720" w:hanging="360"/>
+      </w:pPr>
+      <w:rPr>
+        <w:rFonts w:ascii="Symbol" w:hAnsi="Symbol" w:hint="default"/>
+        <w:sz w:val="20"/>
+      </w:rPr>
+    </w:lvl>
+    <w:lvl w:ilvl="1" w:tentative="1">
+      <w:start w:val="1"/>
+      <w:numFmt w:val="bullet"/>
+      <w:lvlText w:val=""/>
+      <w:lvlJc w:val="left"/>
+      <w:pPr>
+        <w:tabs>
+          <w:tab w:val="num" w:pos="1440"/>
+        </w:tabs>
+        <w:ind w:left="1440" w:hanging="360"/>
+      </w:pPr>
+      <w:rPr>
+        <w:rFonts w:ascii="Symbol" w:hAnsi="Symbol" w:hint="default"/>
+        <w:sz w:val="20"/>
+      </w:rPr>
+    </w:lvl>
+    <w:lvl w:ilvl="2" w:tentative="1">
+      <w:start w:val="1"/>
+      <w:numFmt w:val="bullet"/>
+      <w:lvlText w:val=""/>
+      <w:lvlJc w:val="left"/>
+      <w:pPr>
+        <w:tabs>
+          <w:tab w:val="num" w:pos="2160"/>
+        </w:tabs>
+        <w:ind w:left="2160" w:hanging="360"/>
+      </w:pPr>
+      <w:rPr>
+        <w:rFonts w:ascii="Symbol" w:hAnsi="Symbol" w:hint="default"/>
+        <w:sz w:val="20"/>
+      </w:rPr>
+    </w:lvl>
+    <w:lvl w:ilvl="3" w:tentative="1">
+      <w:start w:val="1"/>
+      <w:numFmt w:val="bullet"/>
+      <w:lvlText w:val=""/>
+      <w:lvlJc w:val="left"/>
+      <w:pPr>
+        <w:tabs>
+          <w:tab w:val="num" w:pos="2880"/>
+        </w:tabs>
+        <w:ind w:left="2880" w:hanging="360"/>
+      </w:pPr>
+      <w:rPr>
+        <w:rFonts w:ascii="Symbol" w:hAnsi="Symbol" w:hint="default"/>
+        <w:sz w:val="20"/>
+      </w:rPr>
+    </w:lvl>
+    <w:lvl w:ilvl="4" w:tentative="1">
+      <w:start w:val="1"/>
+      <w:numFmt w:val="bullet"/>
+      <w:lvlText w:val=""/>
+      <w:lvlJc w:val="left"/>
+      <w:pPr>
+        <w:tabs>
+          <w:tab w:val="num" w:pos="3600"/>
+        </w:tabs>
+        <w:ind w:left="3600" w:hanging="360"/>
+      </w:pPr>
+      <w:rPr>
+        <w:rFonts w:ascii="Symbol" w:hAnsi="Symbol" w:hint="default"/>
+        <w:sz w:val="20"/>
+      </w:rPr>
+    </w:lvl>
+    <w:lvl w:ilvl="5" w:tentative="1">
+      <w:start w:val="1"/>
+      <w:numFmt w:val="bullet"/>
+      <w:lvlText w:val=""/>
+      <w:lvlJc w:val="left"/>
+      <w:pPr>
+        <w:tabs>
+          <w:tab w:val="num" w:pos="4320"/>
+        </w:tabs>
+        <w:ind w:left="4320" w:hanging="360"/>
+      </w:pPr>
+      <w:rPr>
+        <w:rFonts w:ascii="Symbol" w:hAnsi="Symbol" w:hint="default"/>
+        <w:sz w:val="20"/>
+      </w:rPr>
+    </w:lvl>
+    <w:lvl w:ilvl="6" w:tentative="1">
+      <w:start w:val="1"/>
+      <w:numFmt w:val="bullet"/>
+      <w:lvlText w:val=""/>
+      <w:lvlJc w:val="left"/>
+      <w:pPr>
+        <w:tabs>
+          <w:tab w:val="num" w:pos="5040"/>
+        </w:tabs>
+        <w:ind w:left="5040" w:hanging="360"/>
+      </w:pPr>
+      <w:rPr>
+        <w:rFonts w:ascii="Symbol" w:hAnsi="Symbol" w:hint="default"/>
+        <w:sz w:val="20"/>
+      </w:rPr>
+    </w:lvl>
+    <w:lvl w:ilvl="7" w:tentative="1">
+      <w:start w:val="1"/>
+      <w:numFmt w:val="bullet"/>
+      <w:lvlText w:val=""/>
+      <w:lvlJc w:val="left"/>
+      <w:pPr>
+        <w:tabs>
+          <w:tab w:val="num" w:pos="5760"/>
+        </w:tabs>
+        <w:ind w:left="5760" w:hanging="360"/>
+      </w:pPr>
+      <w:rPr>
+        <w:rFonts w:ascii="Symbol" w:hAnsi="Symbol" w:hint="default"/>
+        <w:sz w:val="20"/>
+      </w:rPr>
+    </w:lvl>
+    <w:lvl w:ilvl="8" w:tentative="1">
+      <w:start w:val="1"/>
+      <w:numFmt w:val="bullet"/>
+      <w:lvlText w:val=""/>
+      <w:lvlJc w:val="left"/>
+      <w:pPr>
+        <w:tabs>
+          <w:tab w:val="num" w:pos="6480"/>
+        </w:tabs>
+        <w:ind w:left="6480" w:hanging="360"/>
+      </w:pPr>
+      <w:rPr>
+        <w:rFonts w:ascii="Symbol" w:hAnsi="Symbol" w:hint="default"/>
+        <w:sz w:val="20"/>
+      </w:rPr>
+    </w:lvl>
+  </w:abstractNum>
   <w:num w:numId="1" w16cid:durableId="711660795">
+    <w:abstractNumId w:val="9"/>
+  </w:num>
+  <w:num w:numId="2" w16cid:durableId="1193225170">
+    <w:abstractNumId w:val="13"/>
+  </w:num>
+  <w:num w:numId="3" w16cid:durableId="1916621097">
+    <w:abstractNumId w:val="6"/>
+  </w:num>
+  <w:num w:numId="4" w16cid:durableId="221642763">
+    <w:abstractNumId w:val="8"/>
+  </w:num>
+  <w:num w:numId="5" w16cid:durableId="1107966947">
+    <w:abstractNumId w:val="7"/>
+  </w:num>
+  <w:num w:numId="6" w16cid:durableId="1132404875">
+    <w:abstractNumId w:val="3"/>
+  </w:num>
+  <w:num w:numId="7" w16cid:durableId="1807505853">
+    <w:abstractNumId w:val="2"/>
+  </w:num>
+  <w:num w:numId="8" w16cid:durableId="300306088">
+    <w:abstractNumId w:val="11"/>
+  </w:num>
+  <w:num w:numId="9" w16cid:durableId="1417248659">
+    <w:abstractNumId w:val="4"/>
+  </w:num>
+  <w:num w:numId="10" w16cid:durableId="1533760888">
+    <w:abstractNumId w:val="12"/>
+  </w:num>
+  <w:num w:numId="11" w16cid:durableId="272135178">
+    <w:abstractNumId w:val="1"/>
+  </w:num>
+  <w:num w:numId="12" w16cid:durableId="1149247508">
+    <w:abstractNumId w:val="10"/>
+  </w:num>
+  <w:num w:numId="13" w16cid:durableId="785320110">
+    <w:abstractNumId w:val="5"/>
+  </w:num>
+  <w:num w:numId="14" w16cid:durableId="552274428">
     <w:abstractNumId w:val="0"/>
   </w:num>
 </w:numbering>

</xml_diff>